<commit_message>
Porta l'analisi ANSC alla v3.45: numeratore comunale e forzatura
- Ripristina le parole troncate da «atti.» in 16 punti
- Sostituisce le sequence con la tabella NUMERATORE_COMUNALE gestita da num-ansc-sipo, rigenera l'ERD
- Regola la forzatura (solo l'ufficiale dello stato civile, codice registrato a operazione avvenuta), chiude OP-21
- Aggiunge le revisioni v0.1/v0.2 della v3.44 e i diagrammi degli atti non gestiti

Co-Authored-By: Claude Opus 5.5 <noreply@anthropic.com>
</commit_message>
<xml_diff>
--- a/Documenti finali/PROCESSO_Numerazione-Comunale_SIPO-ANSC_v0.1.docx
+++ b/Documenti finali/PROCESSO_Numerazione-Comunale_SIPO-ANSC_v0.1.docx
@@ -1512,23 +1512,6 @@
           <w:lang w:val="it-IT"/>
         </w:rPr>
       </w:pPr>
-    </w:p>
-    <w:p>
-      <w:pPr>
-        <w:jc w:val="both"/>
-        <w:rPr>
-          <w:rFonts w:eastAsiaTheme="minorEastAsia"/>
-          <w:lang w:val="it-IT"/>
-        </w:rPr>
-      </w:pPr>
-      <w:r>
-        <w:rPr>
-          <w:rFonts w:eastAsiaTheme="minorEastAsia"/>
-          <w:lang w:val="it-IT"/>
-        </w:rPr>
-        <w:lastRenderedPageBreak/>
-        <w:br w:type="page"/>
-      </w:r>
     </w:p>
     <w:sdt>
       <w:sdtPr>
@@ -1593,7 +1576,7 @@
             </w:rPr>
             <w:fldChar w:fldCharType="separate"/>
           </w:r>
-          <w:hyperlink w:anchor="_Toc243571221" w:history="1">
+          <w:hyperlink w:anchor="_Toc243635715" w:history="1">
             <w:r>
               <w:rPr>
                 <w:rStyle w:val="Collegamentoipertestuale"/>
@@ -1637,7 +1620,7 @@
                 <w:noProof/>
                 <w:webHidden/>
               </w:rPr>
-              <w:instrText xml:space="preserve"> PAGEREF _Toc243571221 \h </w:instrText>
+              <w:instrText xml:space="preserve"> PAGEREF _Toc243635715 \h </w:instrText>
             </w:r>
             <w:r>
               <w:rPr>
@@ -1681,7 +1664,7 @@
               <w:lang w:val="it-IT" w:eastAsia="it-IT"/>
             </w:rPr>
           </w:pPr>
-          <w:hyperlink w:anchor="_Toc243571222" w:history="1">
+          <w:hyperlink w:anchor="_Toc243635716" w:history="1">
             <w:r>
               <w:rPr>
                 <w:rStyle w:val="Collegamentoipertestuale"/>
@@ -1725,7 +1708,7 @@
                 <w:noProof/>
                 <w:webHidden/>
               </w:rPr>
-              <w:instrText xml:space="preserve"> PAGEREF _Toc243571222 \h </w:instrText>
+              <w:instrText xml:space="preserve"> PAGEREF _Toc243635716 \h </w:instrText>
             </w:r>
             <w:r>
               <w:rPr>
@@ -1769,7 +1752,7 @@
               <w:lang w:val="it-IT" w:eastAsia="it-IT"/>
             </w:rPr>
           </w:pPr>
-          <w:hyperlink w:anchor="_Toc243571223" w:history="1">
+          <w:hyperlink w:anchor="_Toc243635717" w:history="1">
             <w:r>
               <w:rPr>
                 <w:rStyle w:val="Collegamentoipertestuale"/>
@@ -1813,7 +1796,7 @@
                 <w:noProof/>
                 <w:webHidden/>
               </w:rPr>
-              <w:instrText xml:space="preserve"> PAGEREF _Toc243571223 \h </w:instrText>
+              <w:instrText xml:space="preserve"> PAGEREF _Toc243635717 \h </w:instrText>
             </w:r>
             <w:r>
               <w:rPr>
@@ -1857,7 +1840,7 @@
               <w:lang w:val="it-IT" w:eastAsia="it-IT"/>
             </w:rPr>
           </w:pPr>
-          <w:hyperlink w:anchor="_Toc243571224" w:history="1">
+          <w:hyperlink w:anchor="_Toc243635718" w:history="1">
             <w:r>
               <w:rPr>
                 <w:rStyle w:val="Collegamentoipertestuale"/>
@@ -1901,7 +1884,7 @@
                 <w:noProof/>
                 <w:webHidden/>
               </w:rPr>
-              <w:instrText xml:space="preserve"> PAGEREF _Toc243571224 \h </w:instrText>
+              <w:instrText xml:space="preserve"> PAGEREF _Toc243635718 \h </w:instrText>
             </w:r>
             <w:r>
               <w:rPr>
@@ -1945,7 +1928,7 @@
               <w:lang w:val="it-IT" w:eastAsia="it-IT"/>
             </w:rPr>
           </w:pPr>
-          <w:hyperlink w:anchor="_Toc243571225" w:history="1">
+          <w:hyperlink w:anchor="_Toc243635719" w:history="1">
             <w:r>
               <w:rPr>
                 <w:rStyle w:val="Collegamentoipertestuale"/>
@@ -1989,7 +1972,7 @@
                 <w:noProof/>
                 <w:webHidden/>
               </w:rPr>
-              <w:instrText xml:space="preserve"> PAGEREF _Toc243571225 \h </w:instrText>
+              <w:instrText xml:space="preserve"> PAGEREF _Toc243635719 \h </w:instrText>
             </w:r>
             <w:r>
               <w:rPr>
@@ -2033,7 +2016,7 @@
               <w:lang w:val="it-IT" w:eastAsia="it-IT"/>
             </w:rPr>
           </w:pPr>
-          <w:hyperlink w:anchor="_Toc243571226" w:history="1">
+          <w:hyperlink w:anchor="_Toc243635720" w:history="1">
             <w:r>
               <w:rPr>
                 <w:rStyle w:val="Collegamentoipertestuale"/>
@@ -2077,7 +2060,7 @@
                 <w:noProof/>
                 <w:webHidden/>
               </w:rPr>
-              <w:instrText xml:space="preserve"> PAGEREF _Toc243571226 \h </w:instrText>
+              <w:instrText xml:space="preserve"> PAGEREF _Toc243635720 \h </w:instrText>
             </w:r>
             <w:r>
               <w:rPr>
@@ -2121,7 +2104,7 @@
               <w:lang w:val="it-IT" w:eastAsia="it-IT"/>
             </w:rPr>
           </w:pPr>
-          <w:hyperlink w:anchor="_Toc243571227" w:history="1">
+          <w:hyperlink w:anchor="_Toc243635721" w:history="1">
             <w:r>
               <w:rPr>
                 <w:rStyle w:val="Collegamentoipertestuale"/>
@@ -2167,7 +2150,7 @@
                 <w:noProof/>
                 <w:webHidden/>
               </w:rPr>
-              <w:instrText xml:space="preserve"> PAGEREF _Toc243571227 \h </w:instrText>
+              <w:instrText xml:space="preserve"> PAGEREF _Toc243635721 \h </w:instrText>
             </w:r>
             <w:r>
               <w:rPr>
@@ -2211,7 +2194,7 @@
               <w:lang w:val="it-IT" w:eastAsia="it-IT"/>
             </w:rPr>
           </w:pPr>
-          <w:hyperlink w:anchor="_Toc243571228" w:history="1">
+          <w:hyperlink w:anchor="_Toc243635722" w:history="1">
             <w:r>
               <w:rPr>
                 <w:rStyle w:val="Collegamentoipertestuale"/>
@@ -2257,7 +2240,7 @@
                 <w:noProof/>
                 <w:webHidden/>
               </w:rPr>
-              <w:instrText xml:space="preserve"> PAGEREF _Toc243571228 \h </w:instrText>
+              <w:instrText xml:space="preserve"> PAGEREF _Toc243635722 \h </w:instrText>
             </w:r>
             <w:r>
               <w:rPr>
@@ -2301,7 +2284,7 @@
               <w:lang w:val="it-IT" w:eastAsia="it-IT"/>
             </w:rPr>
           </w:pPr>
-          <w:hyperlink w:anchor="_Toc243571229" w:history="1">
+          <w:hyperlink w:anchor="_Toc243635723" w:history="1">
             <w:r>
               <w:rPr>
                 <w:rStyle w:val="Collegamentoipertestuale"/>
@@ -2347,7 +2330,7 @@
                 <w:noProof/>
                 <w:webHidden/>
               </w:rPr>
-              <w:instrText xml:space="preserve"> PAGEREF _Toc243571229 \h </w:instrText>
+              <w:instrText xml:space="preserve"> PAGEREF _Toc243635723 \h </w:instrText>
             </w:r>
             <w:r>
               <w:rPr>
@@ -2391,7 +2374,7 @@
               <w:lang w:val="it-IT" w:eastAsia="it-IT"/>
             </w:rPr>
           </w:pPr>
-          <w:hyperlink w:anchor="_Toc243571230" w:history="1">
+          <w:hyperlink w:anchor="_Toc243635724" w:history="1">
             <w:r>
               <w:rPr>
                 <w:rStyle w:val="Collegamentoipertestuale"/>
@@ -2437,7 +2420,7 @@
                 <w:noProof/>
                 <w:webHidden/>
               </w:rPr>
-              <w:instrText xml:space="preserve"> PAGEREF _Toc243571230 \h </w:instrText>
+              <w:instrText xml:space="preserve"> PAGEREF _Toc243635724 \h </w:instrText>
             </w:r>
             <w:r>
               <w:rPr>
@@ -2481,7 +2464,7 @@
               <w:lang w:val="it-IT" w:eastAsia="it-IT"/>
             </w:rPr>
           </w:pPr>
-          <w:hyperlink w:anchor="_Toc243571231" w:history="1">
+          <w:hyperlink w:anchor="_Toc243635725" w:history="1">
             <w:r>
               <w:rPr>
                 <w:rStyle w:val="Collegamentoipertestuale"/>
@@ -2527,7 +2510,7 @@
                 <w:noProof/>
                 <w:webHidden/>
               </w:rPr>
-              <w:instrText xml:space="preserve"> PAGEREF _Toc243571231 \h </w:instrText>
+              <w:instrText xml:space="preserve"> PAGEREF _Toc243635725 \h </w:instrText>
             </w:r>
             <w:r>
               <w:rPr>
@@ -2571,7 +2554,7 @@
               <w:lang w:val="it-IT" w:eastAsia="it-IT"/>
             </w:rPr>
           </w:pPr>
-          <w:hyperlink w:anchor="_Toc243571232" w:history="1">
+          <w:hyperlink w:anchor="_Toc243635726" w:history="1">
             <w:r>
               <w:rPr>
                 <w:rStyle w:val="Collegamentoipertestuale"/>
@@ -2617,7 +2600,7 @@
                 <w:noProof/>
                 <w:webHidden/>
               </w:rPr>
-              <w:instrText xml:space="preserve"> PAGEREF _Toc243571232 \h </w:instrText>
+              <w:instrText xml:space="preserve"> PAGEREF _Toc243635726 \h </w:instrText>
             </w:r>
             <w:r>
               <w:rPr>
@@ -2661,7 +2644,7 @@
               <w:lang w:val="it-IT" w:eastAsia="it-IT"/>
             </w:rPr>
           </w:pPr>
-          <w:hyperlink w:anchor="_Toc243571233" w:history="1">
+          <w:hyperlink w:anchor="_Toc243635727" w:history="1">
             <w:r>
               <w:rPr>
                 <w:rStyle w:val="Collegamentoipertestuale"/>
@@ -2705,7 +2688,7 @@
                 <w:noProof/>
                 <w:webHidden/>
               </w:rPr>
-              <w:instrText xml:space="preserve"> PAGEREF _Toc243571233 \h </w:instrText>
+              <w:instrText xml:space="preserve"> PAGEREF _Toc243635727 \h </w:instrText>
             </w:r>
             <w:r>
               <w:rPr>
@@ -2749,7 +2732,7 @@
               <w:lang w:val="it-IT" w:eastAsia="it-IT"/>
             </w:rPr>
           </w:pPr>
-          <w:hyperlink w:anchor="_Toc243571234" w:history="1">
+          <w:hyperlink w:anchor="_Toc243635728" w:history="1">
             <w:r>
               <w:rPr>
                 <w:rStyle w:val="Collegamentoipertestuale"/>
@@ -2793,7 +2776,7 @@
                 <w:noProof/>
                 <w:webHidden/>
               </w:rPr>
-              <w:instrText xml:space="preserve"> PAGEREF _Toc243571234 \h </w:instrText>
+              <w:instrText xml:space="preserve"> PAGEREF _Toc243635728 \h </w:instrText>
             </w:r>
             <w:r>
               <w:rPr>
@@ -2837,7 +2820,7 @@
               <w:lang w:val="it-IT" w:eastAsia="it-IT"/>
             </w:rPr>
           </w:pPr>
-          <w:hyperlink w:anchor="_Toc243571235" w:history="1">
+          <w:hyperlink w:anchor="_Toc243635729" w:history="1">
             <w:r>
               <w:rPr>
                 <w:rStyle w:val="Collegamentoipertestuale"/>
@@ -2881,7 +2864,7 @@
                 <w:noProof/>
                 <w:webHidden/>
               </w:rPr>
-              <w:instrText xml:space="preserve"> PAGEREF _Toc243571235 \h </w:instrText>
+              <w:instrText xml:space="preserve"> PAGEREF _Toc243635729 \h </w:instrText>
             </w:r>
             <w:r>
               <w:rPr>
@@ -2925,7 +2908,7 @@
               <w:lang w:val="it-IT" w:eastAsia="it-IT"/>
             </w:rPr>
           </w:pPr>
-          <w:hyperlink w:anchor="_Toc243571236" w:history="1">
+          <w:hyperlink w:anchor="_Toc243635730" w:history="1">
             <w:r>
               <w:rPr>
                 <w:rStyle w:val="Collegamentoipertestuale"/>
@@ -2969,7 +2952,7 @@
                 <w:noProof/>
                 <w:webHidden/>
               </w:rPr>
-              <w:instrText xml:space="preserve"> PAGEREF _Toc243571236 \h </w:instrText>
+              <w:instrText xml:space="preserve"> PAGEREF _Toc243635730 \h </w:instrText>
             </w:r>
             <w:r>
               <w:rPr>
@@ -3013,7 +2996,7 @@
               <w:lang w:val="it-IT" w:eastAsia="it-IT"/>
             </w:rPr>
           </w:pPr>
-          <w:hyperlink w:anchor="_Toc243571237" w:history="1">
+          <w:hyperlink w:anchor="_Toc243635731" w:history="1">
             <w:r>
               <w:rPr>
                 <w:rStyle w:val="Collegamentoipertestuale"/>
@@ -3057,7 +3040,7 @@
                 <w:noProof/>
                 <w:webHidden/>
               </w:rPr>
-              <w:instrText xml:space="preserve"> PAGEREF _Toc243571237 \h </w:instrText>
+              <w:instrText xml:space="preserve"> PAGEREF _Toc243635731 \h </w:instrText>
             </w:r>
             <w:r>
               <w:rPr>
@@ -3101,7 +3084,7 @@
               <w:lang w:val="it-IT" w:eastAsia="it-IT"/>
             </w:rPr>
           </w:pPr>
-          <w:hyperlink w:anchor="_Toc243571238" w:history="1">
+          <w:hyperlink w:anchor="_Toc243635732" w:history="1">
             <w:r>
               <w:rPr>
                 <w:rStyle w:val="Collegamentoipertestuale"/>
@@ -3145,7 +3128,7 @@
                 <w:noProof/>
                 <w:webHidden/>
               </w:rPr>
-              <w:instrText xml:space="preserve"> PAGEREF _Toc243571238 \h </w:instrText>
+              <w:instrText xml:space="preserve"> PAGEREF _Toc243635732 \h </w:instrText>
             </w:r>
             <w:r>
               <w:rPr>
@@ -3189,7 +3172,7 @@
               <w:lang w:val="it-IT" w:eastAsia="it-IT"/>
             </w:rPr>
           </w:pPr>
-          <w:hyperlink w:anchor="_Toc243571239" w:history="1">
+          <w:hyperlink w:anchor="_Toc243635733" w:history="1">
             <w:r>
               <w:rPr>
                 <w:rStyle w:val="Collegamentoipertestuale"/>
@@ -3212,7 +3195,7 @@
                 <w:noProof/>
                 <w:lang w:val="it-IT"/>
               </w:rPr>
-              <w:t>La serie</w:t>
+              <w:t>NUMERATORE_COMUNALE</w:t>
             </w:r>
             <w:r>
               <w:rPr>
@@ -3233,7 +3216,7 @@
                 <w:noProof/>
                 <w:webHidden/>
               </w:rPr>
-              <w:instrText xml:space="preserve"> PAGEREF _Toc243571239 \h </w:instrText>
+              <w:instrText xml:space="preserve"> PAGEREF _Toc243635733 \h </w:instrText>
             </w:r>
             <w:r>
               <w:rPr>
@@ -3277,7 +3260,7 @@
               <w:lang w:val="it-IT" w:eastAsia="it-IT"/>
             </w:rPr>
           </w:pPr>
-          <w:hyperlink w:anchor="_Toc243571240" w:history="1">
+          <w:hyperlink w:anchor="_Toc243635734" w:history="1">
             <w:r>
               <w:rPr>
                 <w:rStyle w:val="Collegamentoipertestuale"/>
@@ -3300,6 +3283,358 @@
                 <w:noProof/>
                 <w:lang w:val="it-IT"/>
               </w:rPr>
+              <w:t>Le tabelle della Numerazione Comunale</w:t>
+            </w:r>
+            <w:r>
+              <w:rPr>
+                <w:noProof/>
+                <w:webHidden/>
+              </w:rPr>
+              <w:tab/>
+            </w:r>
+            <w:r>
+              <w:rPr>
+                <w:noProof/>
+                <w:webHidden/>
+              </w:rPr>
+              <w:fldChar w:fldCharType="begin"/>
+            </w:r>
+            <w:r>
+              <w:rPr>
+                <w:noProof/>
+                <w:webHidden/>
+              </w:rPr>
+              <w:instrText xml:space="preserve"> PAGEREF _Toc243635734 \h </w:instrText>
+            </w:r>
+            <w:r>
+              <w:rPr>
+                <w:noProof/>
+                <w:webHidden/>
+              </w:rPr>
+            </w:r>
+            <w:r>
+              <w:rPr>
+                <w:noProof/>
+                <w:webHidden/>
+              </w:rPr>
+              <w:fldChar w:fldCharType="separate"/>
+            </w:r>
+            <w:r>
+              <w:rPr>
+                <w:noProof/>
+                <w:webHidden/>
+              </w:rPr>
+              <w:t>14</w:t>
+            </w:r>
+            <w:r>
+              <w:rPr>
+                <w:noProof/>
+                <w:webHidden/>
+              </w:rPr>
+              <w:fldChar w:fldCharType="end"/>
+            </w:r>
+          </w:hyperlink>
+        </w:p>
+        <w:p>
+          <w:pPr>
+            <w:pStyle w:val="Sommario3"/>
+            <w:tabs>
+              <w:tab w:val="left" w:pos="1440"/>
+              <w:tab w:val="right" w:leader="dot" w:pos="9350"/>
+            </w:tabs>
+            <w:rPr>
+              <w:rFonts w:eastAsiaTheme="minorEastAsia"/>
+              <w:noProof/>
+              <w:lang w:val="it-IT" w:eastAsia="it-IT"/>
+            </w:rPr>
+          </w:pPr>
+          <w:hyperlink w:anchor="_Toc243635735" w:history="1">
+            <w:r>
+              <w:rPr>
+                <w:rStyle w:val="Collegamentoipertestuale"/>
+                <w:bCs/>
+                <w:iCs/>
+                <w:noProof/>
+              </w:rPr>
+              <w:t>6.4.1.</w:t>
+            </w:r>
+            <w:r>
+              <w:rPr>
+                <w:rFonts w:eastAsiaTheme="minorEastAsia"/>
+                <w:noProof/>
+                <w:lang w:val="it-IT" w:eastAsia="it-IT"/>
+              </w:rPr>
+              <w:tab/>
+            </w:r>
+            <w:r>
+              <w:rPr>
+                <w:rStyle w:val="Collegamentoipertestuale"/>
+                <w:noProof/>
+              </w:rPr>
+              <w:t>NUMERATORE_COMUNALE</w:t>
+            </w:r>
+            <w:r>
+              <w:rPr>
+                <w:noProof/>
+                <w:webHidden/>
+              </w:rPr>
+              <w:tab/>
+            </w:r>
+            <w:r>
+              <w:rPr>
+                <w:noProof/>
+                <w:webHidden/>
+              </w:rPr>
+              <w:fldChar w:fldCharType="begin"/>
+            </w:r>
+            <w:r>
+              <w:rPr>
+                <w:noProof/>
+                <w:webHidden/>
+              </w:rPr>
+              <w:instrText xml:space="preserve"> PAGEREF _Toc243635735 \h </w:instrText>
+            </w:r>
+            <w:r>
+              <w:rPr>
+                <w:noProof/>
+                <w:webHidden/>
+              </w:rPr>
+            </w:r>
+            <w:r>
+              <w:rPr>
+                <w:noProof/>
+                <w:webHidden/>
+              </w:rPr>
+              <w:fldChar w:fldCharType="separate"/>
+            </w:r>
+            <w:r>
+              <w:rPr>
+                <w:noProof/>
+                <w:webHidden/>
+              </w:rPr>
+              <w:t>14</w:t>
+            </w:r>
+            <w:r>
+              <w:rPr>
+                <w:noProof/>
+                <w:webHidden/>
+              </w:rPr>
+              <w:fldChar w:fldCharType="end"/>
+            </w:r>
+          </w:hyperlink>
+        </w:p>
+        <w:p>
+          <w:pPr>
+            <w:pStyle w:val="Sommario3"/>
+            <w:tabs>
+              <w:tab w:val="left" w:pos="1440"/>
+              <w:tab w:val="right" w:leader="dot" w:pos="9350"/>
+            </w:tabs>
+            <w:rPr>
+              <w:rFonts w:eastAsiaTheme="minorEastAsia"/>
+              <w:noProof/>
+              <w:lang w:val="it-IT" w:eastAsia="it-IT"/>
+            </w:rPr>
+          </w:pPr>
+          <w:hyperlink w:anchor="_Toc243635736" w:history="1">
+            <w:r>
+              <w:rPr>
+                <w:rStyle w:val="Collegamentoipertestuale"/>
+                <w:bCs/>
+                <w:iCs/>
+                <w:noProof/>
+              </w:rPr>
+              <w:t>6.4.2.</w:t>
+            </w:r>
+            <w:r>
+              <w:rPr>
+                <w:rFonts w:eastAsiaTheme="minorEastAsia"/>
+                <w:noProof/>
+                <w:lang w:val="it-IT" w:eastAsia="it-IT"/>
+              </w:rPr>
+              <w:tab/>
+            </w:r>
+            <w:r>
+              <w:rPr>
+                <w:rStyle w:val="Collegamentoipertestuale"/>
+                <w:noProof/>
+              </w:rPr>
+              <w:t>PRENOTAZIONE_ATTI</w:t>
+            </w:r>
+            <w:r>
+              <w:rPr>
+                <w:noProof/>
+                <w:webHidden/>
+              </w:rPr>
+              <w:tab/>
+            </w:r>
+            <w:r>
+              <w:rPr>
+                <w:noProof/>
+                <w:webHidden/>
+              </w:rPr>
+              <w:fldChar w:fldCharType="begin"/>
+            </w:r>
+            <w:r>
+              <w:rPr>
+                <w:noProof/>
+                <w:webHidden/>
+              </w:rPr>
+              <w:instrText xml:space="preserve"> PAGEREF _Toc243635736 \h </w:instrText>
+            </w:r>
+            <w:r>
+              <w:rPr>
+                <w:noProof/>
+                <w:webHidden/>
+              </w:rPr>
+            </w:r>
+            <w:r>
+              <w:rPr>
+                <w:noProof/>
+                <w:webHidden/>
+              </w:rPr>
+              <w:fldChar w:fldCharType="separate"/>
+            </w:r>
+            <w:r>
+              <w:rPr>
+                <w:noProof/>
+                <w:webHidden/>
+              </w:rPr>
+              <w:t>14</w:t>
+            </w:r>
+            <w:r>
+              <w:rPr>
+                <w:noProof/>
+                <w:webHidden/>
+              </w:rPr>
+              <w:fldChar w:fldCharType="end"/>
+            </w:r>
+          </w:hyperlink>
+        </w:p>
+        <w:p>
+          <w:pPr>
+            <w:pStyle w:val="Sommario3"/>
+            <w:tabs>
+              <w:tab w:val="left" w:pos="1440"/>
+              <w:tab w:val="right" w:leader="dot" w:pos="9350"/>
+            </w:tabs>
+            <w:rPr>
+              <w:rFonts w:eastAsiaTheme="minorEastAsia"/>
+              <w:noProof/>
+              <w:lang w:val="it-IT" w:eastAsia="it-IT"/>
+            </w:rPr>
+          </w:pPr>
+          <w:hyperlink w:anchor="_Toc243635737" w:history="1">
+            <w:r>
+              <w:rPr>
+                <w:rStyle w:val="Collegamentoipertestuale"/>
+                <w:bCs/>
+                <w:iCs/>
+                <w:noProof/>
+              </w:rPr>
+              <w:t>6.4.3.</w:t>
+            </w:r>
+            <w:r>
+              <w:rPr>
+                <w:rFonts w:eastAsiaTheme="minorEastAsia"/>
+                <w:noProof/>
+                <w:lang w:val="it-IT" w:eastAsia="it-IT"/>
+              </w:rPr>
+              <w:tab/>
+            </w:r>
+            <w:r>
+              <w:rPr>
+                <w:rStyle w:val="Collegamentoipertestuale"/>
+                <w:noProof/>
+              </w:rPr>
+              <w:t>DATI_ATTO_ESTERNO</w:t>
+            </w:r>
+            <w:r>
+              <w:rPr>
+                <w:noProof/>
+                <w:webHidden/>
+              </w:rPr>
+              <w:tab/>
+            </w:r>
+            <w:r>
+              <w:rPr>
+                <w:noProof/>
+                <w:webHidden/>
+              </w:rPr>
+              <w:fldChar w:fldCharType="begin"/>
+            </w:r>
+            <w:r>
+              <w:rPr>
+                <w:noProof/>
+                <w:webHidden/>
+              </w:rPr>
+              <w:instrText xml:space="preserve"> PAGEREF _Toc243635737 \h </w:instrText>
+            </w:r>
+            <w:r>
+              <w:rPr>
+                <w:noProof/>
+                <w:webHidden/>
+              </w:rPr>
+            </w:r>
+            <w:r>
+              <w:rPr>
+                <w:noProof/>
+                <w:webHidden/>
+              </w:rPr>
+              <w:fldChar w:fldCharType="separate"/>
+            </w:r>
+            <w:r>
+              <w:rPr>
+                <w:noProof/>
+                <w:webHidden/>
+              </w:rPr>
+              <w:t>14</w:t>
+            </w:r>
+            <w:r>
+              <w:rPr>
+                <w:noProof/>
+                <w:webHidden/>
+              </w:rPr>
+              <w:fldChar w:fldCharType="end"/>
+            </w:r>
+          </w:hyperlink>
+        </w:p>
+        <w:p>
+          <w:pPr>
+            <w:pStyle w:val="Sommario2"/>
+            <w:tabs>
+              <w:tab w:val="left" w:pos="960"/>
+              <w:tab w:val="right" w:leader="dot" w:pos="9350"/>
+            </w:tabs>
+            <w:rPr>
+              <w:rFonts w:eastAsiaTheme="minorEastAsia"/>
+              <w:noProof/>
+              <w:lang w:val="it-IT" w:eastAsia="it-IT"/>
+            </w:rPr>
+          </w:pPr>
+          <w:hyperlink w:anchor="_Toc243635738" w:history="1">
+            <w:r>
+              <w:rPr>
+                <w:rStyle w:val="Collegamentoipertestuale"/>
+                <w:noProof/>
+                <w:lang w:val="it-IT"/>
+              </w:rPr>
+              <w:t>6.5.</w:t>
+            </w:r>
+            <w:r>
+              <w:rPr>
+                <w:rFonts w:eastAsiaTheme="minorEastAsia"/>
+                <w:noProof/>
+                <w:lang w:val="it-IT" w:eastAsia="it-IT"/>
+              </w:rPr>
+              <w:tab/>
+            </w:r>
+            <w:r>
+              <w:rPr>
+                <w:rStyle w:val="Collegamentoipertestuale"/>
+                <w:noProof/>
+                <w:lang w:val="it-IT"/>
+              </w:rPr>
               <w:t>Il servizio num-ansc-sipo</w:t>
             </w:r>
             <w:r>
@@ -3321,7 +3656,7 @@
                 <w:noProof/>
                 <w:webHidden/>
               </w:rPr>
-              <w:instrText xml:space="preserve"> PAGEREF _Toc243571240 \h </w:instrText>
+              <w:instrText xml:space="preserve"> PAGEREF _Toc243635738 \h </w:instrText>
             </w:r>
             <w:r>
               <w:rPr>
@@ -3341,7 +3676,7 @@
                 <w:noProof/>
                 <w:webHidden/>
               </w:rPr>
-              <w:t>14</w:t>
+              <w:t>15</w:t>
             </w:r>
             <w:r>
               <w:rPr>
@@ -3365,7 +3700,7 @@
               <w:lang w:val="it-IT" w:eastAsia="it-IT"/>
             </w:rPr>
           </w:pPr>
-          <w:hyperlink w:anchor="_Toc243571241" w:history="1">
+          <w:hyperlink w:anchor="_Toc243635739" w:history="1">
             <w:r>
               <w:rPr>
                 <w:rStyle w:val="Collegamentoipertestuale"/>
@@ -3409,7 +3744,7 @@
                 <w:noProof/>
                 <w:webHidden/>
               </w:rPr>
-              <w:instrText xml:space="preserve"> PAGEREF _Toc243571241 \h </w:instrText>
+              <w:instrText xml:space="preserve"> PAGEREF _Toc243635739 \h </w:instrText>
             </w:r>
             <w:r>
               <w:rPr>
@@ -3429,7 +3764,7 @@
                 <w:noProof/>
                 <w:webHidden/>
               </w:rPr>
-              <w:t>15</w:t>
+              <w:t>16</w:t>
             </w:r>
             <w:r>
               <w:rPr>
@@ -3453,7 +3788,7 @@
               <w:lang w:val="it-IT" w:eastAsia="it-IT"/>
             </w:rPr>
           </w:pPr>
-          <w:hyperlink w:anchor="_Toc243571242" w:history="1">
+          <w:hyperlink w:anchor="_Toc243635740" w:history="1">
             <w:r>
               <w:rPr>
                 <w:rStyle w:val="Collegamentoipertestuale"/>
@@ -3497,7 +3832,7 @@
                 <w:noProof/>
                 <w:webHidden/>
               </w:rPr>
-              <w:instrText xml:space="preserve"> PAGEREF _Toc243571242 \h </w:instrText>
+              <w:instrText xml:space="preserve"> PAGEREF _Toc243635740 \h </w:instrText>
             </w:r>
             <w:r>
               <w:rPr>
@@ -3517,7 +3852,7 @@
                 <w:noProof/>
                 <w:webHidden/>
               </w:rPr>
-              <w:t>16</w:t>
+              <w:t>17</w:t>
             </w:r>
             <w:r>
               <w:rPr>
@@ -3541,7 +3876,7 @@
               <w:lang w:val="it-IT" w:eastAsia="it-IT"/>
             </w:rPr>
           </w:pPr>
-          <w:hyperlink w:anchor="_Toc243571243" w:history="1">
+          <w:hyperlink w:anchor="_Toc243635741" w:history="1">
             <w:r>
               <w:rPr>
                 <w:rStyle w:val="Collegamentoipertestuale"/>
@@ -3585,7 +3920,7 @@
                 <w:noProof/>
                 <w:webHidden/>
               </w:rPr>
-              <w:instrText xml:space="preserve"> PAGEREF _Toc243571243 \h </w:instrText>
+              <w:instrText xml:space="preserve"> PAGEREF _Toc243635741 \h </w:instrText>
             </w:r>
             <w:r>
               <w:rPr>
@@ -3605,7 +3940,7 @@
                 <w:noProof/>
                 <w:webHidden/>
               </w:rPr>
-              <w:t>16</w:t>
+              <w:t>17</w:t>
             </w:r>
             <w:r>
               <w:rPr>
@@ -3629,7 +3964,7 @@
               <w:lang w:val="it-IT" w:eastAsia="it-IT"/>
             </w:rPr>
           </w:pPr>
-          <w:hyperlink w:anchor="_Toc243571244" w:history="1">
+          <w:hyperlink w:anchor="_Toc243635742" w:history="1">
             <w:r>
               <w:rPr>
                 <w:rStyle w:val="Collegamentoipertestuale"/>
@@ -3673,7 +4008,7 @@
                 <w:noProof/>
                 <w:webHidden/>
               </w:rPr>
-              <w:instrText xml:space="preserve"> PAGEREF _Toc243571244 \h </w:instrText>
+              <w:instrText xml:space="preserve"> PAGEREF _Toc243635742 \h </w:instrText>
             </w:r>
             <w:r>
               <w:rPr>
@@ -3693,7 +4028,7 @@
                 <w:noProof/>
                 <w:webHidden/>
               </w:rPr>
-              <w:t>16</w:t>
+              <w:t>17</w:t>
             </w:r>
             <w:r>
               <w:rPr>
@@ -3750,7 +4085,7 @@
           <w:lang w:val="it-IT"/>
         </w:rPr>
       </w:pPr>
-      <w:bookmarkStart w:id="0" w:name="_Toc243571221"/>
+      <w:bookmarkStart w:id="0" w:name="_Toc243635715"/>
       <w:r>
         <w:rPr>
           <w:lang w:val="it-IT"/>
@@ -3796,7 +4131,7 @@
           <w:lang w:val="it-IT"/>
         </w:rPr>
       </w:pPr>
-      <w:bookmarkStart w:id="1" w:name="_Toc243571222"/>
+      <w:bookmarkStart w:id="1" w:name="_Toc243635716"/>
       <w:r>
         <w:rPr>
           <w:lang w:val="it-IT"/>
@@ -3922,39 +4257,7 @@
                 <w:sz w:val="18"/>
                 <w:lang w:val="it-IT"/>
               </w:rPr>
-              <w:t>Sorgenti Documentali/</w:t>
-            </w:r>
-            <w:proofErr w:type="spellStart"/>
-            <w:r>
-              <w:rPr>
-                <w:sz w:val="18"/>
-                <w:lang w:val="it-IT"/>
-              </w:rPr>
-              <w:t>CdMI</w:t>
-            </w:r>
-            <w:proofErr w:type="spellEnd"/>
-            <w:r>
-              <w:rPr>
-                <w:sz w:val="18"/>
-                <w:lang w:val="it-IT"/>
-              </w:rPr>
-              <w:t xml:space="preserve"> </w:t>
-            </w:r>
-            <w:proofErr w:type="spellStart"/>
-            <w:r>
-              <w:rPr>
-                <w:sz w:val="18"/>
-                <w:lang w:val="it-IT"/>
-              </w:rPr>
-              <w:t>SIDe</w:t>
-            </w:r>
-            <w:proofErr w:type="spellEnd"/>
-            <w:r>
-              <w:rPr>
-                <w:sz w:val="18"/>
-                <w:lang w:val="it-IT"/>
-              </w:rPr>
-              <w:t xml:space="preserve"> MI_ANSC - Processo di gestione della numerazione comunale v1.0.docx</w:t>
+              <w:t>Sorgenti Documentali/CdMI SIDe MI_ANSC - Processo di gestione della numerazione comunale v1.0.docx</w:t>
             </w:r>
           </w:p>
         </w:tc>
@@ -4036,23 +4339,7 @@
                 <w:sz w:val="18"/>
                 <w:lang w:val="it-IT"/>
               </w:rPr>
-              <w:t xml:space="preserve">La serie per anno, le garanzie, le strutture ereditate, i percorsi, il servizio </w:t>
-            </w:r>
-            <w:proofErr w:type="spellStart"/>
-            <w:r>
-              <w:rPr>
-                <w:sz w:val="18"/>
-                <w:lang w:val="it-IT"/>
-              </w:rPr>
-              <w:t>num-ansc-sipo</w:t>
-            </w:r>
-            <w:proofErr w:type="spellEnd"/>
-            <w:r>
-              <w:rPr>
-                <w:sz w:val="18"/>
-                <w:lang w:val="it-IT"/>
-              </w:rPr>
-              <w:t>, lo stacco passo per passo.</w:t>
+              <w:t>La serie per anno, le garanzie, le strutture ereditate, i percorsi, il servizio num-ansc-sipo, lo stacco passo per passo.</w:t>
             </w:r>
           </w:p>
         </w:tc>
@@ -4260,7 +4547,7 @@
           <w:lang w:val="it-IT"/>
         </w:rPr>
       </w:pPr>
-      <w:bookmarkStart w:id="2" w:name="_Toc243571223"/>
+      <w:bookmarkStart w:id="2" w:name="_Toc243635717"/>
       <w:r>
         <w:rPr>
           <w:lang w:val="it-IT"/>
@@ -4363,25 +4650,7 @@
                 <w:sz w:val="18"/>
                 <w:lang w:val="it-IT"/>
               </w:rPr>
-              <w:t>Il progressivo che il Comune assegna all’atto; viaggia nel modello evento (</w:t>
-            </w:r>
-            <w:proofErr w:type="spellStart"/>
-            <w:proofErr w:type="gramStart"/>
-            <w:r>
-              <w:rPr>
-                <w:sz w:val="18"/>
-                <w:lang w:val="it-IT"/>
-              </w:rPr>
-              <w:t>evento.numeroatto</w:t>
-            </w:r>
-            <w:proofErr w:type="spellEnd"/>
-            <w:proofErr w:type="gramEnd"/>
-            <w:r>
-              <w:rPr>
-                <w:sz w:val="18"/>
-                <w:lang w:val="it-IT"/>
-              </w:rPr>
-              <w:t>) e compone l’identificativo nazionale.</w:t>
+              <w:t>Il progressivo che il Comune assegna all’atto; viaggia nel modello evento (evento.numeroatto) e compone l’identificativo nazionale.</w:t>
             </w:r>
           </w:p>
         </w:tc>
@@ -4566,7 +4835,6 @@
                 <w:lang w:val="it-IT"/>
               </w:rPr>
             </w:pPr>
-            <w:proofErr w:type="spellStart"/>
             <w:r>
               <w:rPr>
                 <w:sz w:val="18"/>
@@ -4574,7 +4842,6 @@
               </w:rPr>
               <w:t>num-ansc-sipo</w:t>
             </w:r>
-            <w:proofErr w:type="spellEnd"/>
           </w:p>
         </w:tc>
         <w:tc>
@@ -4615,7 +4882,7 @@
           <w:lang w:val="it-IT"/>
         </w:rPr>
       </w:pPr>
-      <w:bookmarkStart w:id="3" w:name="_Toc243571224"/>
+      <w:bookmarkStart w:id="3" w:name="_Toc243635718"/>
       <w:r>
         <w:rPr>
           <w:lang w:val="it-IT"/>
@@ -4970,23 +5237,7 @@
                 <w:sz w:val="18"/>
                 <w:lang w:val="it-IT"/>
               </w:rPr>
-              <w:t>Servizio della numerazione (</w:t>
-            </w:r>
-            <w:proofErr w:type="spellStart"/>
-            <w:r>
-              <w:rPr>
-                <w:sz w:val="18"/>
-                <w:lang w:val="it-IT"/>
-              </w:rPr>
-              <w:t>num-ansc-sipo</w:t>
-            </w:r>
-            <w:proofErr w:type="spellEnd"/>
-            <w:r>
-              <w:rPr>
-                <w:sz w:val="18"/>
-                <w:lang w:val="it-IT"/>
-              </w:rPr>
-              <w:t>)</w:t>
+              <w:t>Servizio della numerazione (num-ansc-sipo)</w:t>
             </w:r>
           </w:p>
         </w:tc>
@@ -5096,13 +5347,15 @@
     </w:tbl>
     <w:p>
       <w:pPr>
-        <w:rPr>
-          <w:lang w:val="it-IT"/>
-        </w:rPr>
-      </w:pPr>
-    </w:p>
-    <w:p>
-      <w:pPr>
+        <w:jc w:val="both"/>
+        <w:rPr>
+          <w:lang w:val="it-IT"/>
+        </w:rPr>
+      </w:pPr>
+    </w:p>
+    <w:p>
+      <w:pPr>
+        <w:jc w:val="both"/>
         <w:rPr>
           <w:lang w:val="it-IT"/>
         </w:rPr>
@@ -5122,7 +5375,7 @@
           <w:lang w:val="it-IT"/>
         </w:rPr>
       </w:pPr>
-      <w:bookmarkStart w:id="4" w:name="_Toc243571225"/>
+      <w:bookmarkStart w:id="4" w:name="_Toc243635719"/>
       <w:r>
         <w:rPr>
           <w:lang w:val="it-IT"/>
@@ -5255,28 +5508,132 @@
           <w:lang w:val="it-IT"/>
         </w:rPr>
       </w:pPr>
-      <w:bookmarkStart w:id="5" w:name="_Toc243571226"/>
+      <w:bookmarkStart w:id="5" w:name="_Toc243635720"/>
+      <w:r>
+        <w:rPr>
+          <w:lang w:val="it-IT"/>
+        </w:rPr>
+        <w:t>Scenari</w:t>
+      </w:r>
+      <w:bookmarkEnd w:id="5"/>
+    </w:p>
+    <w:p>
+      <w:pPr>
+        <w:jc w:val="both"/>
+        <w:rPr>
+          <w:lang w:val="it-IT"/>
+        </w:rPr>
+      </w:pPr>
+      <w:r>
+        <w:rPr>
+          <w:lang w:val="it-IT"/>
+        </w:rPr>
+        <w:t xml:space="preserve">I </w:t>
+      </w:r>
+      <w:r>
+        <w:rPr>
+          <w:lang w:val="it-IT"/>
+        </w:rPr>
+        <w:t>possibili scenari estratti da quelli esistenti in</w:t>
+      </w:r>
+      <w:r>
+        <w:rPr>
+          <w:lang w:val="it-IT"/>
+        </w:rPr>
+        <w:t xml:space="preserve"> Side.</w:t>
+      </w:r>
+    </w:p>
+    <w:p>
+      <w:pPr>
+        <w:pStyle w:val="Titolo3"/>
+        <w:jc w:val="both"/>
+        <w:rPr>
+          <w:lang w:val="it-IT"/>
+        </w:rPr>
+      </w:pPr>
+      <w:bookmarkStart w:id="6" w:name="_Toc243635721"/>
       <w:r>
         <w:rPr>
           <w:lang w:val="it-IT"/>
         </w:rPr>
         <w:lastRenderedPageBreak/>
-        <w:t>Scenari</w:t>
-      </w:r>
-      <w:bookmarkEnd w:id="5"/>
-    </w:p>
-    <w:p>
-      <w:pPr>
-        <w:jc w:val="both"/>
-        <w:rPr>
-          <w:lang w:val="it-IT"/>
-        </w:rPr>
-      </w:pPr>
-      <w:r>
-        <w:rPr>
-          <w:lang w:val="it-IT"/>
-        </w:rPr>
-        <w:t>I primi sei sono quelli di Side, adattati; gli ultimi tre sono propri di Roma, perché qui passano dalla serie anche gli atti formati in SIPO.</w:t>
+        <w:t>Scenario 1 – Atto formato sulla web app: uso ordinario</w:t>
+      </w:r>
+      <w:bookmarkEnd w:id="6"/>
+    </w:p>
+    <w:p>
+      <w:pPr>
+        <w:pStyle w:val="Paragrafoelenco"/>
+        <w:jc w:val="both"/>
+        <w:rPr>
+          <w:lang w:val="it-IT"/>
+        </w:rPr>
+      </w:pPr>
+      <w:r>
+        <w:rPr>
+          <w:lang w:val="it-IT"/>
+        </w:rPr>
+        <w:t>Completo l’atto sulla web app e mi fermo alla validazione, che chiede il numero comunale.</w:t>
+      </w:r>
+    </w:p>
+    <w:p>
+      <w:pPr>
+        <w:pStyle w:val="Paragrafoelenco"/>
+        <w:jc w:val="both"/>
+        <w:rPr>
+          <w:lang w:val="it-IT"/>
+        </w:rPr>
+      </w:pPr>
+      <w:r>
+        <w:rPr>
+          <w:lang w:val="it-IT"/>
+        </w:rPr>
+        <w:t>Nella pagina di richiesta del back-office stacco un numero dell’anno corrente.</w:t>
+      </w:r>
+    </w:p>
+    <w:p>
+      <w:pPr>
+        <w:pStyle w:val="Paragrafoelenco"/>
+        <w:jc w:val="both"/>
+        <w:rPr>
+          <w:lang w:val="it-IT"/>
+        </w:rPr>
+      </w:pPr>
+      <w:r>
+        <w:rPr>
+          <w:lang w:val="it-IT"/>
+        </w:rPr>
+        <w:t>Il numero compare nella tabella, nello stato Disponibile.</w:t>
+      </w:r>
+    </w:p>
+    <w:p>
+      <w:pPr>
+        <w:pStyle w:val="Paragrafoelenco"/>
+        <w:jc w:val="both"/>
+        <w:rPr>
+          <w:lang w:val="it-IT"/>
+        </w:rPr>
+      </w:pPr>
+      <w:r>
+        <w:rPr>
+          <w:lang w:val="it-IT"/>
+        </w:rPr>
+        <w:t>Inserisco il numero nella web app e valido l’atto.</w:t>
+      </w:r>
+    </w:p>
+    <w:p>
+      <w:pPr>
+        <w:pStyle w:val="Paragrafoelenco"/>
+        <w:jc w:val="both"/>
+        <w:rPr>
+          <w:lang w:val="it-IT"/>
+        </w:rPr>
+      </w:pPr>
+      <w:r>
+        <w:rPr>
+          <w:lang w:val="it-IT"/>
+        </w:rPr>
+        <w:t>Segno il numero come Utilizzato, indicando l’identificativo nazionale che ANSC ha assegnato: lo stato passa da 1 Disponibile a 2 Utilizzato.</w:t>
       </w:r>
     </w:p>
     <w:p>
@@ -5287,14 +5644,14 @@
           <w:lang w:val="it-IT"/>
         </w:rPr>
       </w:pPr>
-      <w:bookmarkStart w:id="6" w:name="_Toc243571227"/>
-      <w:r>
-        <w:rPr>
-          <w:lang w:val="it-IT"/>
-        </w:rPr>
-        <w:t>Scenario 1 – Atto formato sulla web app: uso ordinario</w:t>
-      </w:r>
-      <w:bookmarkEnd w:id="6"/>
+      <w:bookmarkStart w:id="7" w:name="_Toc243635722"/>
+      <w:r>
+        <w:rPr>
+          <w:lang w:val="it-IT"/>
+        </w:rPr>
+        <w:t>Scenario 2 – Numeri consecutivi per gli atti dei gemelli</w:t>
+      </w:r>
+      <w:bookmarkEnd w:id="7"/>
     </w:p>
     <w:p>
       <w:pPr>
@@ -5308,7 +5665,7 @@
         <w:rPr>
           <w:lang w:val="it-IT"/>
         </w:rPr>
-        <w:t>Completo l’atto sulla web app e mi fermo alla validazione, che chiede il numero comunale.</w:t>
+        <w:t>Prima di cominciare stacco, con una sola richiesta, tanti numeri quanti i nati.</w:t>
       </w:r>
     </w:p>
     <w:p>
@@ -5323,7 +5680,7 @@
         <w:rPr>
           <w:lang w:val="it-IT"/>
         </w:rPr>
-        <w:t>Nella pagina di richiesta del back-office stacco un numero dell’anno corrente.</w:t>
+        <w:t>I numeri sono consecutivi: gli stacchi sono serializzati e nessuna richiesta contemporanea può intercalarsi.</w:t>
       </w:r>
     </w:p>
     <w:p>
@@ -5338,7 +5695,7 @@
         <w:rPr>
           <w:lang w:val="it-IT"/>
         </w:rPr>
-        <w:t>Il numero compare nella tabella, nello stato Disponibile.</w:t>
+        <w:t>Li uso sulla web app, oppure in SIPO, dove la prenotazione degli atti dei gemelli (R009 /prenota/evento) li richiede tutti insieme.</w:t>
       </w:r>
     </w:p>
     <w:p>
@@ -5353,8 +5710,25 @@
         <w:rPr>
           <w:lang w:val="it-IT"/>
         </w:rPr>
-        <w:t>Inserisco il numero nella web app e valido l’atto.</w:t>
-      </w:r>
+        <w:t>Ciascun numero segue poi la sorte del proprio atto.</w:t>
+      </w:r>
+    </w:p>
+    <w:p>
+      <w:pPr>
+        <w:pStyle w:val="Titolo3"/>
+        <w:jc w:val="both"/>
+        <w:rPr>
+          <w:lang w:val="it-IT"/>
+        </w:rPr>
+      </w:pPr>
+      <w:bookmarkStart w:id="8" w:name="_Toc243635723"/>
+      <w:r>
+        <w:rPr>
+          <w:lang w:val="it-IT"/>
+        </w:rPr>
+        <w:t>Scenario 3 – Numero non utilizzato</w:t>
+      </w:r>
+      <w:bookmarkEnd w:id="8"/>
     </w:p>
     <w:p>
       <w:pPr>
@@ -5368,7 +5742,37 @@
         <w:rPr>
           <w:lang w:val="it-IT"/>
         </w:rPr>
-        <w:t>Segno il numero come Utilizzato, indicando l’identificativo nazionale che ANSC ha assegnato: lo stato passa da 1 Disponibile a 2 Utilizzato.</w:t>
+        <w:t>Stacco un numero.</w:t>
+      </w:r>
+    </w:p>
+    <w:p>
+      <w:pPr>
+        <w:pStyle w:val="Paragrafoelenco"/>
+        <w:jc w:val="both"/>
+        <w:rPr>
+          <w:lang w:val="it-IT"/>
+        </w:rPr>
+      </w:pPr>
+      <w:r>
+        <w:rPr>
+          <w:lang w:val="it-IT"/>
+        </w:rPr>
+        <w:t>Non mi serve più: l’atto non si conclude o viene annullato.</w:t>
+      </w:r>
+    </w:p>
+    <w:p>
+      <w:pPr>
+        <w:pStyle w:val="Paragrafoelenco"/>
+        <w:jc w:val="both"/>
+        <w:rPr>
+          <w:lang w:val="it-IT"/>
+        </w:rPr>
+      </w:pPr>
+      <w:r>
+        <w:rPr>
+          <w:lang w:val="it-IT"/>
+        </w:rPr>
+        <w:t>Segno il numero come Scartato, dopo una conferma: lo stato passa da 1 Disponibile a 3 Scartato ed è finale.</w:t>
       </w:r>
     </w:p>
     <w:p>
@@ -5379,14 +5783,26 @@
           <w:lang w:val="it-IT"/>
         </w:rPr>
       </w:pPr>
-      <w:bookmarkStart w:id="7" w:name="_Toc243571228"/>
-      <w:r>
-        <w:rPr>
-          <w:lang w:val="it-IT"/>
-        </w:rPr>
-        <w:t>Scenario 2 – Numeri consecutivi per gli atti dei gemelli</w:t>
-      </w:r>
-      <w:bookmarkEnd w:id="7"/>
+      <w:bookmarkStart w:id="9" w:name="_Toc243635724"/>
+      <w:r>
+        <w:rPr>
+          <w:lang w:val="it-IT"/>
+        </w:rPr>
+        <w:t xml:space="preserve">Scenario </w:t>
+      </w:r>
+      <w:r>
+        <w:rPr>
+          <w:lang w:val="it-IT"/>
+        </w:rPr>
+        <w:t>4</w:t>
+      </w:r>
+      <w:r>
+        <w:rPr>
+          <w:lang w:val="it-IT"/>
+        </w:rPr>
+        <w:t xml:space="preserve"> – Consultazione delle richieste</w:t>
+      </w:r>
+      <w:bookmarkEnd w:id="9"/>
     </w:p>
     <w:p>
       <w:pPr>
@@ -5400,7 +5816,7 @@
         <w:rPr>
           <w:lang w:val="it-IT"/>
         </w:rPr>
-        <w:t>Prima di cominciare stacco, con una sola richiesta, tanti numeri quanti i nati.</w:t>
+        <w:t>Apro la pagina di ricerca e consultazione.</w:t>
       </w:r>
     </w:p>
     <w:p>
@@ -5415,7 +5831,7 @@
         <w:rPr>
           <w:lang w:val="it-IT"/>
         </w:rPr>
-        <w:t>I numeri sono consecutivi: gli stacchi sono serializzati e nessuna richiesta contemporanea può intercalarsi.</w:t>
+        <w:t>Imposto i filtri: le due date sono obbligatorie.</w:t>
       </w:r>
     </w:p>
     <w:p>
@@ -5430,7 +5846,7 @@
         <w:rPr>
           <w:lang w:val="it-IT"/>
         </w:rPr>
-        <w:t>Li uso sulla web app, oppure in SIPO, dove la prenotazione degli atti dei gemelli (R009 /prenota/evento) li richiede tutti insieme.</w:t>
+        <w:t>Leggo le richieste e i numeri in tabella, con le serie in testa.</w:t>
       </w:r>
     </w:p>
     <w:p>
@@ -5445,7 +5861,7 @@
         <w:rPr>
           <w:lang w:val="it-IT"/>
         </w:rPr>
-        <w:t>Ciascun numero segue poi la sorte del proprio atto.</w:t>
+        <w:t>Sui numeri Disponibili posso cambiare lo stato; su un Utilizzato posso legare l’atto di SIPO.</w:t>
       </w:r>
     </w:p>
     <w:p>
@@ -5456,14 +5872,26 @@
           <w:lang w:val="it-IT"/>
         </w:rPr>
       </w:pPr>
-      <w:bookmarkStart w:id="8" w:name="_Toc243571229"/>
-      <w:r>
-        <w:rPr>
-          <w:lang w:val="it-IT"/>
-        </w:rPr>
-        <w:t>Scenario 3 – Numero non utilizzato</w:t>
-      </w:r>
-      <w:bookmarkEnd w:id="8"/>
+      <w:bookmarkStart w:id="10" w:name="_Toc243635725"/>
+      <w:r>
+        <w:rPr>
+          <w:lang w:val="it-IT"/>
+        </w:rPr>
+        <w:t xml:space="preserve">Scenario </w:t>
+      </w:r>
+      <w:r>
+        <w:rPr>
+          <w:lang w:val="it-IT"/>
+        </w:rPr>
+        <w:t>5</w:t>
+      </w:r>
+      <w:r>
+        <w:rPr>
+          <w:lang w:val="it-IT"/>
+        </w:rPr>
+        <w:t xml:space="preserve"> – Atto formato in SIPO</w:t>
+      </w:r>
+      <w:bookmarkEnd w:id="10"/>
     </w:p>
     <w:p>
       <w:pPr>
@@ -5477,7 +5905,7 @@
         <w:rPr>
           <w:lang w:val="it-IT"/>
         </w:rPr>
-        <w:t>Stacco un numero.</w:t>
+        <w:t>All’anteprima il concentratore stacca un numero legato all’atto, senza che l’ufficiale apra il back-office.</w:t>
       </w:r>
     </w:p>
     <w:p>
@@ -5492,7 +5920,7 @@
         <w:rPr>
           <w:lang w:val="it-IT"/>
         </w:rPr>
-        <w:t>Non mi serve più: l’atto non si conclude o viene annullato.</w:t>
+        <w:t>Se la validazione R009 riesce, il numero passa a Utilizzato con l’identificativo nazionale.</w:t>
       </w:r>
     </w:p>
     <w:p>
@@ -5507,7 +5935,38 @@
         <w:rPr>
           <w:lang w:val="it-IT"/>
         </w:rPr>
-        <w:t>Segno il numero come Scartato, dopo una conferma: lo stato passa da 1 Disponibile a 3 Scartato ed è finale.</w:t>
+        <w:lastRenderedPageBreak/>
+        <w:t>Se la validazione è respinta, il numero resta all’atto e si riusa al tentativo successivo: la serie non ne consuma un altro.</w:t>
+      </w:r>
+    </w:p>
+    <w:p>
+      <w:pPr>
+        <w:pStyle w:val="Paragrafoelenco"/>
+        <w:jc w:val="both"/>
+        <w:rPr>
+          <w:lang w:val="it-IT"/>
+        </w:rPr>
+      </w:pPr>
+      <w:r>
+        <w:rPr>
+          <w:lang w:val="it-IT"/>
+        </w:rPr>
+        <w:t>Se l’atto è abbandonato prima del deposito, il numero passa a Scartato.</w:t>
+      </w:r>
+    </w:p>
+    <w:p>
+      <w:pPr>
+        <w:pStyle w:val="Paragrafoelenco"/>
+        <w:jc w:val="both"/>
+        <w:rPr>
+          <w:lang w:val="it-IT"/>
+        </w:rPr>
+      </w:pPr>
+      <w:r>
+        <w:rPr>
+          <w:lang w:val="it-IT"/>
+        </w:rPr>
+        <w:t>Le righe sono visibili nella pagina di ricerca, con l’atto di SIPO valorizzato.</w:t>
       </w:r>
     </w:p>
     <w:p>
@@ -5518,7 +5977,7 @@
           <w:lang w:val="it-IT"/>
         </w:rPr>
       </w:pPr>
-      <w:bookmarkStart w:id="9" w:name="_Toc243571230"/>
+      <w:bookmarkStart w:id="11" w:name="_Toc243635726"/>
       <w:r>
         <w:rPr>
           <w:lang w:val="it-IT"/>
@@ -5529,15 +5988,15 @@
         <w:rPr>
           <w:lang w:val="it-IT"/>
         </w:rPr>
-        <w:t>4</w:t>
-      </w:r>
-      <w:r>
-        <w:rPr>
-          <w:lang w:val="it-IT"/>
-        </w:rPr>
-        <w:t xml:space="preserve"> – Consultazione delle richieste</w:t>
-      </w:r>
-      <w:bookmarkEnd w:id="9"/>
+        <w:t>6</w:t>
+      </w:r>
+      <w:r>
+        <w:rPr>
+          <w:lang w:val="it-IT"/>
+        </w:rPr>
+        <w:t xml:space="preserve"> – Aggancio di un atto formato sulla web app</w:t>
+      </w:r>
+      <w:bookmarkEnd w:id="11"/>
     </w:p>
     <w:p>
       <w:pPr>
@@ -5551,7 +6010,7 @@
         <w:rPr>
           <w:lang w:val="it-IT"/>
         </w:rPr>
-        <w:t>Apro la pagina di ricerca e consultazione.</w:t>
+        <w:t>Un atto formato sulla web app viene agganciato in SIPO.</w:t>
       </w:r>
     </w:p>
     <w:p>
@@ -5566,215 +6025,7 @@
         <w:rPr>
           <w:lang w:val="it-IT"/>
         </w:rPr>
-        <w:t>Imposto i filtri: le due date sono obbligatorie.</w:t>
-      </w:r>
-    </w:p>
-    <w:p>
-      <w:pPr>
-        <w:pStyle w:val="Paragrafoelenco"/>
-        <w:jc w:val="both"/>
-        <w:rPr>
-          <w:lang w:val="it-IT"/>
-        </w:rPr>
-      </w:pPr>
-      <w:r>
-        <w:rPr>
-          <w:lang w:val="it-IT"/>
-        </w:rPr>
-        <w:t>Leggo le richieste e i numeri in tabella, con le serie in testa.</w:t>
-      </w:r>
-    </w:p>
-    <w:p>
-      <w:pPr>
-        <w:pStyle w:val="Paragrafoelenco"/>
-        <w:jc w:val="both"/>
-        <w:rPr>
-          <w:lang w:val="it-IT"/>
-        </w:rPr>
-      </w:pPr>
-      <w:r>
-        <w:rPr>
-          <w:lang w:val="it-IT"/>
-        </w:rPr>
-        <w:t>Sui numeri Disponibili posso cambiare lo stato; su un Utilizzato posso legare l’atto di SIPO.</w:t>
-      </w:r>
-    </w:p>
-    <w:p>
-      <w:pPr>
-        <w:pStyle w:val="Titolo3"/>
-        <w:jc w:val="both"/>
-        <w:rPr>
-          <w:lang w:val="it-IT"/>
-        </w:rPr>
-      </w:pPr>
-      <w:bookmarkStart w:id="10" w:name="_Toc243571231"/>
-      <w:r>
-        <w:rPr>
-          <w:lang w:val="it-IT"/>
-        </w:rPr>
-        <w:lastRenderedPageBreak/>
-        <w:t xml:space="preserve">Scenario </w:t>
-      </w:r>
-      <w:r>
-        <w:rPr>
-          <w:lang w:val="it-IT"/>
-        </w:rPr>
-        <w:t>5</w:t>
-      </w:r>
-      <w:r>
-        <w:rPr>
-          <w:lang w:val="it-IT"/>
-        </w:rPr>
-        <w:t xml:space="preserve"> – Atto formato in SIPO</w:t>
-      </w:r>
-      <w:bookmarkEnd w:id="10"/>
-    </w:p>
-    <w:p>
-      <w:pPr>
-        <w:pStyle w:val="Paragrafoelenco"/>
-        <w:jc w:val="both"/>
-        <w:rPr>
-          <w:lang w:val="it-IT"/>
-        </w:rPr>
-      </w:pPr>
-      <w:r>
-        <w:rPr>
-          <w:lang w:val="it-IT"/>
-        </w:rPr>
-        <w:t>All’anteprima il concentratore stacca un numero legato all’atto, senza che l’ufficiale apra il back-office.</w:t>
-      </w:r>
-    </w:p>
-    <w:p>
-      <w:pPr>
-        <w:pStyle w:val="Paragrafoelenco"/>
-        <w:jc w:val="both"/>
-        <w:rPr>
-          <w:lang w:val="it-IT"/>
-        </w:rPr>
-      </w:pPr>
-      <w:r>
-        <w:rPr>
-          <w:lang w:val="it-IT"/>
-        </w:rPr>
-        <w:t>Se la validazione R009 riesce, il numero passa a Utilizzato con l’identificativo nazionale.</w:t>
-      </w:r>
-    </w:p>
-    <w:p>
-      <w:pPr>
-        <w:pStyle w:val="Paragrafoelenco"/>
-        <w:jc w:val="both"/>
-        <w:rPr>
-          <w:lang w:val="it-IT"/>
-        </w:rPr>
-      </w:pPr>
-      <w:r>
-        <w:rPr>
-          <w:lang w:val="it-IT"/>
-        </w:rPr>
-        <w:t>Se la validazione è respinta, il numero resta all’atto e si riusa al tentativo successivo: la serie non ne consuma un altro.</w:t>
-      </w:r>
-    </w:p>
-    <w:p>
-      <w:pPr>
-        <w:pStyle w:val="Paragrafoelenco"/>
-        <w:jc w:val="both"/>
-        <w:rPr>
-          <w:lang w:val="it-IT"/>
-        </w:rPr>
-      </w:pPr>
-      <w:r>
-        <w:rPr>
-          <w:lang w:val="it-IT"/>
-        </w:rPr>
-        <w:t>Se l’atto è abbandonato prima del deposito, il numero passa a Scartato.</w:t>
-      </w:r>
-    </w:p>
-    <w:p>
-      <w:pPr>
-        <w:pStyle w:val="Paragrafoelenco"/>
-        <w:jc w:val="both"/>
-        <w:rPr>
-          <w:lang w:val="it-IT"/>
-        </w:rPr>
-      </w:pPr>
-      <w:r>
-        <w:rPr>
-          <w:lang w:val="it-IT"/>
-        </w:rPr>
-        <w:t>Le righe sono visibili nella pagina di ricerca, con l’atto di SIPO valorizzato.</w:t>
-      </w:r>
-    </w:p>
-    <w:p>
-      <w:pPr>
-        <w:pStyle w:val="Titolo3"/>
-        <w:jc w:val="both"/>
-        <w:rPr>
-          <w:lang w:val="it-IT"/>
-        </w:rPr>
-      </w:pPr>
-      <w:bookmarkStart w:id="11" w:name="_Toc243571232"/>
-      <w:r>
-        <w:rPr>
-          <w:lang w:val="it-IT"/>
-        </w:rPr>
-        <w:t xml:space="preserve">Scenario </w:t>
-      </w:r>
-      <w:r>
-        <w:rPr>
-          <w:lang w:val="it-IT"/>
-        </w:rPr>
-        <w:t>6</w:t>
-      </w:r>
-      <w:r>
-        <w:rPr>
-          <w:lang w:val="it-IT"/>
-        </w:rPr>
-        <w:t xml:space="preserve"> – Aggancio di un atto formato sulla web app</w:t>
-      </w:r>
-      <w:bookmarkEnd w:id="11"/>
-    </w:p>
-    <w:p>
-      <w:pPr>
-        <w:pStyle w:val="Paragrafoelenco"/>
-        <w:jc w:val="both"/>
-        <w:rPr>
-          <w:lang w:val="it-IT"/>
-        </w:rPr>
-      </w:pPr>
-      <w:r>
-        <w:rPr>
-          <w:lang w:val="it-IT"/>
-        </w:rPr>
-        <w:t>Un atto formato sulla web app viene agganciato in SIPO.</w:t>
-      </w:r>
-    </w:p>
-    <w:p>
-      <w:pPr>
-        <w:pStyle w:val="Paragrafoelenco"/>
-        <w:jc w:val="both"/>
-        <w:rPr>
-          <w:lang w:val="it-IT"/>
-        </w:rPr>
-      </w:pPr>
-      <w:r>
-        <w:rPr>
-          <w:lang w:val="it-IT"/>
-        </w:rPr>
-        <w:t xml:space="preserve">Il numero, già Utilizzato, si lega all’atto di SIPO e passa a </w:t>
-      </w:r>
-      <w:proofErr w:type="gramStart"/>
-      <w:r>
-        <w:rPr>
-          <w:lang w:val="it-IT"/>
-        </w:rPr>
-        <w:t>4</w:t>
-      </w:r>
-      <w:proofErr w:type="gramEnd"/>
-      <w:r>
-        <w:rPr>
-          <w:lang w:val="it-IT"/>
-        </w:rPr>
-        <w:t xml:space="preserve"> Evento acquisito, che è finale. È ciò che Side annuncia come «futuro allineamento».</w:t>
+        <w:t>Il numero, già Utilizzato, si lega all’atto di SIPO e passa a 4 Evento acquisito, che è finale. È ciò che Side annuncia come «futuro allineamento».</w:t>
       </w:r>
     </w:p>
     <w:p>
@@ -5785,7 +6036,7 @@
           <w:lang w:val="it-IT"/>
         </w:rPr>
       </w:pPr>
-      <w:bookmarkStart w:id="12" w:name="_Toc243571233"/>
+      <w:bookmarkStart w:id="12" w:name="_Toc243635727"/>
       <w:r>
         <w:rPr>
           <w:lang w:val="it-IT"/>
@@ -5926,39 +6177,12 @@
                 <w:lang w:val="it-IT"/>
               </w:rPr>
             </w:pPr>
-            <w:proofErr w:type="spellStart"/>
-            <w:proofErr w:type="gramStart"/>
-            <w:r>
-              <w:rPr>
-                <w:sz w:val="18"/>
-                <w:lang w:val="it-IT"/>
-              </w:rPr>
-              <w:t>creaPrenotazione</w:t>
-            </w:r>
-            <w:proofErr w:type="spellEnd"/>
-            <w:proofErr w:type="gramEnd"/>
-            <w:r>
-              <w:rPr>
-                <w:sz w:val="18"/>
-                <w:lang w:val="it-IT"/>
-              </w:rPr>
-              <w:t xml:space="preserve"> con l’atto; </w:t>
-            </w:r>
-            <w:proofErr w:type="spellStart"/>
-            <w:r>
-              <w:rPr>
-                <w:sz w:val="18"/>
-                <w:lang w:val="it-IT"/>
-              </w:rPr>
-              <w:t>aggiornaNumero</w:t>
-            </w:r>
-            <w:proofErr w:type="spellEnd"/>
-            <w:r>
-              <w:rPr>
-                <w:sz w:val="18"/>
-                <w:lang w:val="it-IT"/>
-              </w:rPr>
-              <w:t xml:space="preserve"> a Utilizzato al deposito riuscito, a Scartato se l’atto è abbandonato.</w:t>
+            <w:r>
+              <w:rPr>
+                <w:sz w:val="18"/>
+                <w:lang w:val="it-IT"/>
+              </w:rPr>
+              <w:t>creaPrenotazione con l’atto; aggiornaNumero a Utilizzato al deposito riuscito, a Scartato se l’atto è abbandonato.</w:t>
             </w:r>
           </w:p>
         </w:tc>
@@ -6015,37 +6239,12 @@
                 <w:lang w:val="it-IT"/>
               </w:rPr>
             </w:pPr>
-            <w:proofErr w:type="spellStart"/>
-            <w:r>
-              <w:rPr>
-                <w:sz w:val="18"/>
-                <w:lang w:val="it-IT"/>
-              </w:rPr>
-              <w:t>creaPrenotazione</w:t>
-            </w:r>
-            <w:proofErr w:type="spellEnd"/>
-            <w:r>
-              <w:rPr>
-                <w:sz w:val="18"/>
-                <w:lang w:val="it-IT"/>
-              </w:rPr>
-              <w:t xml:space="preserve">; </w:t>
-            </w:r>
-            <w:proofErr w:type="spellStart"/>
-            <w:r>
-              <w:rPr>
-                <w:sz w:val="18"/>
-                <w:lang w:val="it-IT"/>
-              </w:rPr>
-              <w:t>aggiornaNumero</w:t>
-            </w:r>
-            <w:proofErr w:type="spellEnd"/>
-            <w:r>
-              <w:rPr>
-                <w:sz w:val="18"/>
-                <w:lang w:val="it-IT"/>
-              </w:rPr>
-              <w:t xml:space="preserve"> a Utilizzato o a Scartato; a Evento acquisito all’aggancio.</w:t>
+            <w:r>
+              <w:rPr>
+                <w:sz w:val="18"/>
+                <w:lang w:val="it-IT"/>
+              </w:rPr>
+              <w:t>creaPrenotazione; aggiornaNumero a Utilizzato o a Scartato; a Evento acquisito all’aggancio.</w:t>
             </w:r>
           </w:p>
         </w:tc>
@@ -6102,23 +6301,12 @@
                 <w:lang w:val="it-IT"/>
               </w:rPr>
             </w:pPr>
-            <w:proofErr w:type="spellStart"/>
-            <w:proofErr w:type="gramStart"/>
-            <w:r>
-              <w:rPr>
-                <w:sz w:val="18"/>
-                <w:lang w:val="it-IT"/>
-              </w:rPr>
-              <w:t>creaPrenotazione</w:t>
-            </w:r>
-            <w:proofErr w:type="spellEnd"/>
-            <w:proofErr w:type="gramEnd"/>
-            <w:r>
-              <w:rPr>
-                <w:sz w:val="18"/>
-                <w:lang w:val="it-IT"/>
-              </w:rPr>
-              <w:t xml:space="preserve"> con tanti numeri quanti i nati.</w:t>
+            <w:r>
+              <w:rPr>
+                <w:sz w:val="18"/>
+                <w:lang w:val="it-IT"/>
+              </w:rPr>
+              <w:t>creaPrenotazione con tanti numeri quanti i nati.</w:t>
             </w:r>
           </w:p>
         </w:tc>
@@ -6175,21 +6363,12 @@
                 <w:lang w:val="it-IT"/>
               </w:rPr>
             </w:pPr>
-            <w:proofErr w:type="spellStart"/>
-            <w:r>
-              <w:rPr>
-                <w:sz w:val="18"/>
-                <w:lang w:val="it-IT"/>
-              </w:rPr>
-              <w:t>creaNumero</w:t>
-            </w:r>
-            <w:proofErr w:type="spellEnd"/>
-            <w:r>
-              <w:rPr>
-                <w:sz w:val="18"/>
-                <w:lang w:val="it-IT"/>
-              </w:rPr>
-              <w:t>.</w:t>
+            <w:r>
+              <w:rPr>
+                <w:sz w:val="18"/>
+                <w:lang w:val="it-IT"/>
+              </w:rPr>
+              <w:t>creaNumero.</w:t>
             </w:r>
           </w:p>
         </w:tc>
@@ -6246,117 +6425,12 @@
                 <w:lang w:val="it-IT"/>
               </w:rPr>
             </w:pPr>
-            <w:proofErr w:type="spellStart"/>
-            <w:r>
-              <w:rPr>
-                <w:sz w:val="18"/>
-                <w:lang w:val="it-IT"/>
-              </w:rPr>
-              <w:t>elencaSerie</w:t>
-            </w:r>
-            <w:proofErr w:type="spellEnd"/>
-            <w:r>
-              <w:rPr>
-                <w:sz w:val="18"/>
-                <w:lang w:val="it-IT"/>
-              </w:rPr>
-              <w:t xml:space="preserve">, </w:t>
-            </w:r>
-            <w:proofErr w:type="spellStart"/>
-            <w:r>
-              <w:rPr>
-                <w:sz w:val="18"/>
-                <w:lang w:val="it-IT"/>
-              </w:rPr>
-              <w:t>leggiSerie</w:t>
-            </w:r>
-            <w:proofErr w:type="spellEnd"/>
-            <w:r>
-              <w:rPr>
-                <w:sz w:val="18"/>
-                <w:lang w:val="it-IT"/>
-              </w:rPr>
-              <w:t xml:space="preserve">, </w:t>
-            </w:r>
-            <w:proofErr w:type="spellStart"/>
-            <w:r>
-              <w:rPr>
-                <w:sz w:val="18"/>
-                <w:lang w:val="it-IT"/>
-              </w:rPr>
-              <w:t>creaSerie</w:t>
-            </w:r>
-            <w:proofErr w:type="spellEnd"/>
-            <w:r>
-              <w:rPr>
-                <w:sz w:val="18"/>
-                <w:lang w:val="it-IT"/>
-              </w:rPr>
-              <w:t xml:space="preserve">; </w:t>
-            </w:r>
-            <w:proofErr w:type="spellStart"/>
-            <w:r>
-              <w:rPr>
-                <w:sz w:val="18"/>
-                <w:lang w:val="it-IT"/>
-              </w:rPr>
-              <w:t>elencaPrenotazioni</w:t>
-            </w:r>
-            <w:proofErr w:type="spellEnd"/>
-            <w:r>
-              <w:rPr>
-                <w:sz w:val="18"/>
-                <w:lang w:val="it-IT"/>
-              </w:rPr>
-              <w:t xml:space="preserve">, </w:t>
-            </w:r>
-            <w:proofErr w:type="spellStart"/>
-            <w:r>
-              <w:rPr>
-                <w:sz w:val="18"/>
-                <w:lang w:val="it-IT"/>
-              </w:rPr>
-              <w:t>leggiPrenotazione</w:t>
-            </w:r>
-            <w:proofErr w:type="spellEnd"/>
-            <w:r>
-              <w:rPr>
-                <w:sz w:val="18"/>
-                <w:lang w:val="it-IT"/>
-              </w:rPr>
-              <w:t xml:space="preserve">, </w:t>
-            </w:r>
-            <w:proofErr w:type="spellStart"/>
-            <w:r>
-              <w:rPr>
-                <w:sz w:val="18"/>
-                <w:lang w:val="it-IT"/>
-              </w:rPr>
-              <w:t>elencaNumeri</w:t>
-            </w:r>
-            <w:proofErr w:type="spellEnd"/>
-            <w:r>
-              <w:rPr>
-                <w:sz w:val="18"/>
-                <w:lang w:val="it-IT"/>
-              </w:rPr>
-              <w:t xml:space="preserve">, </w:t>
-            </w:r>
-            <w:proofErr w:type="spellStart"/>
-            <w:r>
-              <w:rPr>
-                <w:sz w:val="18"/>
-                <w:lang w:val="it-IT"/>
-              </w:rPr>
-              <w:t>leggiNumero</w:t>
-            </w:r>
-            <w:proofErr w:type="spellEnd"/>
-            <w:r>
-              <w:rPr>
-                <w:sz w:val="18"/>
-                <w:lang w:val="it-IT"/>
-              </w:rPr>
-              <w:t>.</w:t>
+            <w:r>
+              <w:rPr>
+                <w:sz w:val="18"/>
+                <w:lang w:val="it-IT"/>
+              </w:rPr>
+              <w:t>elencaSerie, leggiSerie, creaSerie; elencaPrenotazioni, leggiPrenotazione, elencaNumeri, leggiNumero.</w:t>
             </w:r>
           </w:p>
         </w:tc>
@@ -6364,13 +6438,15 @@
     </w:tbl>
     <w:p>
       <w:pPr>
-        <w:rPr>
-          <w:lang w:val="it-IT"/>
-        </w:rPr>
-      </w:pPr>
-    </w:p>
-    <w:p>
-      <w:pPr>
+        <w:jc w:val="both"/>
+        <w:rPr>
+          <w:lang w:val="it-IT"/>
+        </w:rPr>
+      </w:pPr>
+    </w:p>
+    <w:p>
+      <w:pPr>
+        <w:jc w:val="both"/>
         <w:rPr>
           <w:lang w:val="it-IT"/>
         </w:rPr>
@@ -6390,7 +6466,7 @@
           <w:lang w:val="it-IT"/>
         </w:rPr>
       </w:pPr>
-      <w:bookmarkStart w:id="13" w:name="_Toc243571234"/>
+      <w:bookmarkStart w:id="13" w:name="_Toc243635728"/>
       <w:r>
         <w:rPr>
           <w:lang w:val="it-IT"/>
@@ -6498,21 +6574,7 @@
         <w:rPr>
           <w:lang w:val="it-IT"/>
         </w:rPr>
-        <w:t xml:space="preserve"> Chiama </w:t>
-      </w:r>
-      <w:proofErr w:type="spellStart"/>
-      <w:r>
-        <w:rPr>
-          <w:lang w:val="it-IT"/>
-        </w:rPr>
-        <w:t>creaPrenotazione</w:t>
-      </w:r>
-      <w:proofErr w:type="spellEnd"/>
-      <w:r>
-        <w:rPr>
-          <w:lang w:val="it-IT"/>
-        </w:rPr>
-        <w:t>: il servizio inserisce una riga in PRENOTAZIONE_ATTI per la richiesta e una in DATI_ATTO_ESTERNO per ogni numero staccato, nello stato 1 Disponibile e senza identificativo nazionale.</w:t>
+        <w:t xml:space="preserve"> Chiama creaPrenotazione: il servizio inserisce una riga in PRENOTAZIONE_ATTI per la richiesta e una in DATI_ATTO_ESTERNO per ogni numero staccato, nello stato 1 Disponibile e senza identificativo nazionale.</w:t>
       </w:r>
     </w:p>
     <w:p>
@@ -6601,21 +6663,7 @@
         <w:rPr>
           <w:lang w:val="it-IT"/>
         </w:rPr>
-        <w:t xml:space="preserve"> Solo su un numero Disponibile. Apre una finestra che chiede l’identificativo nazionale, obbligatorio, e l’atto di SIPO, facoltativo; chiama </w:t>
-      </w:r>
-      <w:proofErr w:type="spellStart"/>
-      <w:r>
-        <w:rPr>
-          <w:lang w:val="it-IT"/>
-        </w:rPr>
-        <w:t>aggiornaNumero</w:t>
-      </w:r>
-      <w:proofErr w:type="spellEnd"/>
-      <w:r>
-        <w:rPr>
-          <w:lang w:val="it-IT"/>
-        </w:rPr>
-        <w:t>.</w:t>
+        <w:t xml:space="preserve"> Solo su un numero Disponibile. Apre una finestra che chiede l’identificativo nazionale, obbligatorio, e l’atto di SIPO, facoltativo; chiama aggiornaNumero.</w:t>
       </w:r>
     </w:p>
     <w:p>
@@ -6637,21 +6685,7 @@
         <w:rPr>
           <w:lang w:val="it-IT"/>
         </w:rPr>
-        <w:t xml:space="preserve"> Solo su un numero Disponibile, dopo una conferma; chiama </w:t>
-      </w:r>
-      <w:proofErr w:type="spellStart"/>
-      <w:r>
-        <w:rPr>
-          <w:lang w:val="it-IT"/>
-        </w:rPr>
-        <w:t>aggiornaNumero</w:t>
-      </w:r>
-      <w:proofErr w:type="spellEnd"/>
-      <w:r>
-        <w:rPr>
-          <w:lang w:val="it-IT"/>
-        </w:rPr>
-        <w:t>. Scartato è finale.</w:t>
+        <w:t xml:space="preserve"> Solo su un numero Disponibile, dopo una conferma; chiama aggiornaNumero. Scartato è finale.</w:t>
       </w:r>
     </w:p>
     <w:p>
@@ -6673,21 +6707,7 @@
         <w:rPr>
           <w:lang w:val="it-IT"/>
         </w:rPr>
-        <w:t xml:space="preserve"> Anno, numero usato e identificativo nazionale; REGISTRA chiama </w:t>
-      </w:r>
-      <w:proofErr w:type="spellStart"/>
-      <w:r>
-        <w:rPr>
-          <w:lang w:val="it-IT"/>
-        </w:rPr>
-        <w:t>creaNumero</w:t>
-      </w:r>
-      <w:proofErr w:type="spellEnd"/>
-      <w:r>
-        <w:rPr>
-          <w:lang w:val="it-IT"/>
-        </w:rPr>
-        <w:t>.</w:t>
+        <w:t xml:space="preserve"> Anno, numero usato e identificativo nazionale; REGISTRA chiama creaNumero.</w:t>
       </w:r>
     </w:p>
     <w:p>
@@ -6763,7 +6783,7 @@
           <w:lang w:val="it-IT"/>
         </w:rPr>
       </w:pPr>
-      <w:bookmarkStart w:id="14" w:name="_Toc243571235"/>
+      <w:bookmarkStart w:id="14" w:name="_Toc243635729"/>
       <w:r>
         <w:rPr>
           <w:lang w:val="it-IT"/>
@@ -6984,31 +7004,13 @@
                 <w:lang w:val="it-IT"/>
               </w:rPr>
             </w:pPr>
-            <w:proofErr w:type="spellStart"/>
-            <w:r>
-              <w:rPr>
-                <w:sz w:val="18"/>
-                <w:lang w:val="it-IT"/>
-              </w:rPr>
-              <w:t>elencaSerie</w:t>
-            </w:r>
-            <w:proofErr w:type="spellEnd"/>
-            <w:r>
-              <w:rPr>
-                <w:sz w:val="18"/>
-                <w:lang w:val="it-IT"/>
-              </w:rPr>
-              <w:t xml:space="preserve">, </w:t>
-            </w:r>
-            <w:proofErr w:type="spellStart"/>
-            <w:r>
-              <w:rPr>
-                <w:sz w:val="18"/>
-                <w:lang w:val="it-IT"/>
-              </w:rPr>
-              <w:t>leggiSerie</w:t>
-            </w:r>
-            <w:proofErr w:type="spellEnd"/>
+            <w:r>
+              <w:rPr>
+                <w:sz w:val="18"/>
+                <w:lang w:val="it-IT"/>
+              </w:rPr>
+              <w:t>elencaSerie, leggiSerie</w:t>
+            </w:r>
           </w:p>
         </w:tc>
       </w:tr>
@@ -7064,31 +7066,13 @@
                 <w:lang w:val="it-IT"/>
               </w:rPr>
             </w:pPr>
-            <w:proofErr w:type="spellStart"/>
-            <w:r>
-              <w:rPr>
-                <w:sz w:val="18"/>
-                <w:lang w:val="it-IT"/>
-              </w:rPr>
-              <w:t>elencaPrenotazioni</w:t>
-            </w:r>
-            <w:proofErr w:type="spellEnd"/>
-            <w:r>
-              <w:rPr>
-                <w:sz w:val="18"/>
-                <w:lang w:val="it-IT"/>
-              </w:rPr>
-              <w:t xml:space="preserve">, </w:t>
-            </w:r>
-            <w:proofErr w:type="spellStart"/>
-            <w:r>
-              <w:rPr>
-                <w:sz w:val="18"/>
-                <w:lang w:val="it-IT"/>
-              </w:rPr>
-              <w:t>elencaNumeri</w:t>
-            </w:r>
-            <w:proofErr w:type="spellEnd"/>
+            <w:r>
+              <w:rPr>
+                <w:sz w:val="18"/>
+                <w:lang w:val="it-IT"/>
+              </w:rPr>
+              <w:t>elencaPrenotazioni, elencaNumeri</w:t>
+            </w:r>
           </w:p>
         </w:tc>
       </w:tr>
@@ -7144,31 +7128,13 @@
                 <w:lang w:val="it-IT"/>
               </w:rPr>
             </w:pPr>
-            <w:proofErr w:type="spellStart"/>
-            <w:r>
-              <w:rPr>
-                <w:sz w:val="18"/>
-                <w:lang w:val="it-IT"/>
-              </w:rPr>
-              <w:t>leggiNumero</w:t>
-            </w:r>
-            <w:proofErr w:type="spellEnd"/>
-            <w:r>
-              <w:rPr>
-                <w:sz w:val="18"/>
-                <w:lang w:val="it-IT"/>
-              </w:rPr>
-              <w:t xml:space="preserve">, </w:t>
-            </w:r>
-            <w:proofErr w:type="spellStart"/>
-            <w:r>
-              <w:rPr>
-                <w:sz w:val="18"/>
-                <w:lang w:val="it-IT"/>
-              </w:rPr>
-              <w:t>leggiPrenotazione</w:t>
-            </w:r>
-            <w:proofErr w:type="spellEnd"/>
+            <w:r>
+              <w:rPr>
+                <w:sz w:val="18"/>
+                <w:lang w:val="it-IT"/>
+              </w:rPr>
+              <w:t>leggiNumero, leggiPrenotazione</w:t>
+            </w:r>
           </w:p>
         </w:tc>
       </w:tr>
@@ -7224,7 +7190,6 @@
                 <w:lang w:val="it-IT"/>
               </w:rPr>
             </w:pPr>
-            <w:proofErr w:type="spellStart"/>
             <w:r>
               <w:rPr>
                 <w:sz w:val="18"/>
@@ -7232,7 +7197,6 @@
               </w:rPr>
               <w:t>aggiornaNumero</w:t>
             </w:r>
-            <w:proofErr w:type="spellEnd"/>
           </w:p>
         </w:tc>
       </w:tr>
@@ -7288,7 +7252,6 @@
                 <w:lang w:val="it-IT"/>
               </w:rPr>
             </w:pPr>
-            <w:proofErr w:type="spellStart"/>
             <w:r>
               <w:rPr>
                 <w:sz w:val="18"/>
@@ -7296,7 +7259,6 @@
               </w:rPr>
               <w:t>aggiornaNumero</w:t>
             </w:r>
-            <w:proofErr w:type="spellEnd"/>
           </w:p>
         </w:tc>
       </w:tr>
@@ -7352,7 +7314,6 @@
                 <w:lang w:val="it-IT"/>
               </w:rPr>
             </w:pPr>
-            <w:proofErr w:type="spellStart"/>
             <w:r>
               <w:rPr>
                 <w:sz w:val="18"/>
@@ -7360,7 +7321,6 @@
               </w:rPr>
               <w:t>creaSerie</w:t>
             </w:r>
-            <w:proofErr w:type="spellEnd"/>
           </w:p>
         </w:tc>
       </w:tr>
@@ -7381,7 +7341,7 @@
           <w:lang w:val="it-IT"/>
         </w:rPr>
       </w:pPr>
-      <w:bookmarkStart w:id="15" w:name="_Toc243571236"/>
+      <w:bookmarkStart w:id="15" w:name="_Toc243635730"/>
       <w:r>
         <w:rPr>
           <w:lang w:val="it-IT"/>
@@ -7413,7 +7373,7 @@
           <w:lang w:val="it-IT"/>
         </w:rPr>
       </w:pPr>
-      <w:bookmarkStart w:id="16" w:name="_Toc243571237"/>
+      <w:bookmarkStart w:id="16" w:name="_Toc243635731"/>
       <w:r>
         <w:rPr>
           <w:lang w:val="it-IT"/>
@@ -7537,7 +7497,6 @@
                 <w:lang w:val="it-IT"/>
               </w:rPr>
             </w:pPr>
-            <w:proofErr w:type="spellStart"/>
             <w:r>
               <w:rPr>
                 <w:sz w:val="18"/>
@@ -7545,7 +7504,6 @@
               </w:rPr>
               <w:t>id_prenotazione_atti</w:t>
             </w:r>
-            <w:proofErr w:type="spellEnd"/>
           </w:p>
         </w:tc>
         <w:tc>
@@ -7621,7 +7579,6 @@
                 <w:lang w:val="it-IT"/>
               </w:rPr>
             </w:pPr>
-            <w:proofErr w:type="spellStart"/>
             <w:r>
               <w:rPr>
                 <w:sz w:val="18"/>
@@ -7629,7 +7586,6 @@
               </w:rPr>
               <w:t>nr_anno_atto</w:t>
             </w:r>
-            <w:proofErr w:type="spellEnd"/>
           </w:p>
         </w:tc>
         <w:tc>
@@ -7643,21 +7599,12 @@
                 <w:lang w:val="it-IT"/>
               </w:rPr>
             </w:pPr>
-            <w:proofErr w:type="gramStart"/>
-            <w:r>
-              <w:rPr>
-                <w:sz w:val="18"/>
-                <w:lang w:val="it-IT"/>
-              </w:rPr>
-              <w:t>NUMBER(</w:t>
-            </w:r>
-            <w:proofErr w:type="gramEnd"/>
-            <w:r>
-              <w:rPr>
-                <w:sz w:val="18"/>
-                <w:lang w:val="it-IT"/>
-              </w:rPr>
-              <w:t>4)</w:t>
+            <w:r>
+              <w:rPr>
+                <w:sz w:val="18"/>
+                <w:lang w:val="it-IT"/>
+              </w:rPr>
+              <w:t>NUMBER(4)</w:t>
             </w:r>
           </w:p>
         </w:tc>
@@ -7714,7 +7661,6 @@
                 <w:lang w:val="it-IT"/>
               </w:rPr>
             </w:pPr>
-            <w:proofErr w:type="spellStart"/>
             <w:r>
               <w:rPr>
                 <w:sz w:val="18"/>
@@ -7722,7 +7668,6 @@
               </w:rPr>
               <w:t>nr_id_ansc_da_prenotare</w:t>
             </w:r>
-            <w:proofErr w:type="spellEnd"/>
           </w:p>
         </w:tc>
         <w:tc>
@@ -7736,21 +7681,12 @@
                 <w:lang w:val="it-IT"/>
               </w:rPr>
             </w:pPr>
-            <w:proofErr w:type="gramStart"/>
-            <w:r>
-              <w:rPr>
-                <w:sz w:val="18"/>
-                <w:lang w:val="it-IT"/>
-              </w:rPr>
-              <w:t>NUMBER(</w:t>
-            </w:r>
-            <w:proofErr w:type="gramEnd"/>
-            <w:r>
-              <w:rPr>
-                <w:sz w:val="18"/>
-                <w:lang w:val="it-IT"/>
-              </w:rPr>
-              <w:t>3)</w:t>
+            <w:r>
+              <w:rPr>
+                <w:sz w:val="18"/>
+                <w:lang w:val="it-IT"/>
+              </w:rPr>
+              <w:t>NUMBER(3)</w:t>
             </w:r>
           </w:p>
         </w:tc>
@@ -7807,7 +7743,6 @@
                 <w:lang w:val="it-IT"/>
               </w:rPr>
             </w:pPr>
-            <w:proofErr w:type="spellStart"/>
             <w:r>
               <w:rPr>
                 <w:sz w:val="18"/>
@@ -7815,7 +7750,6 @@
               </w:rPr>
               <w:t>cd_operatore_prenotazione</w:t>
             </w:r>
-            <w:proofErr w:type="spellEnd"/>
           </w:p>
         </w:tc>
         <w:tc>
@@ -7891,7 +7825,6 @@
                 <w:lang w:val="it-IT"/>
               </w:rPr>
             </w:pPr>
-            <w:proofErr w:type="spellStart"/>
             <w:r>
               <w:rPr>
                 <w:sz w:val="18"/>
@@ -7899,7 +7832,6 @@
               </w:rPr>
               <w:t>ts_prenotazione</w:t>
             </w:r>
-            <w:proofErr w:type="spellEnd"/>
           </w:p>
         </w:tc>
         <w:tc>
@@ -7980,7 +7912,7 @@
           <w:lang w:val="it-IT"/>
         </w:rPr>
       </w:pPr>
-      <w:bookmarkStart w:id="17" w:name="_Toc243571238"/>
+      <w:bookmarkStart w:id="17" w:name="_Toc243635732"/>
       <w:r>
         <w:rPr>
           <w:lang w:val="it-IT"/>
@@ -8104,7 +8036,6 @@
                 <w:lang w:val="it-IT"/>
               </w:rPr>
             </w:pPr>
-            <w:proofErr w:type="spellStart"/>
             <w:r>
               <w:rPr>
                 <w:sz w:val="18"/>
@@ -8112,7 +8043,6 @@
               </w:rPr>
               <w:t>id_prenotazione_atti</w:t>
             </w:r>
-            <w:proofErr w:type="spellEnd"/>
           </w:p>
         </w:tc>
         <w:tc>
@@ -8188,7 +8118,6 @@
                 <w:lang w:val="it-IT"/>
               </w:rPr>
             </w:pPr>
-            <w:proofErr w:type="spellStart"/>
             <w:r>
               <w:rPr>
                 <w:sz w:val="18"/>
@@ -8196,7 +8125,6 @@
               </w:rPr>
               <w:t>nr_atto_comunale</w:t>
             </w:r>
-            <w:proofErr w:type="spellEnd"/>
           </w:p>
         </w:tc>
         <w:tc>
@@ -8210,21 +8138,12 @@
                 <w:lang w:val="it-IT"/>
               </w:rPr>
             </w:pPr>
-            <w:proofErr w:type="gramStart"/>
-            <w:r>
-              <w:rPr>
-                <w:sz w:val="18"/>
-                <w:lang w:val="it-IT"/>
-              </w:rPr>
-              <w:t>NUMBER(</w:t>
-            </w:r>
-            <w:proofErr w:type="gramEnd"/>
-            <w:r>
-              <w:rPr>
-                <w:sz w:val="18"/>
-                <w:lang w:val="it-IT"/>
-              </w:rPr>
-              <w:t>6) (PK)</w:t>
+            <w:r>
+              <w:rPr>
+                <w:sz w:val="18"/>
+                <w:lang w:val="it-IT"/>
+              </w:rPr>
+              <w:t>NUMBER(6) (PK)</w:t>
             </w:r>
           </w:p>
         </w:tc>
@@ -8281,7 +8200,6 @@
                 <w:lang w:val="it-IT"/>
               </w:rPr>
             </w:pPr>
-            <w:proofErr w:type="spellStart"/>
             <w:r>
               <w:rPr>
                 <w:sz w:val="18"/>
@@ -8289,7 +8207,6 @@
               </w:rPr>
               <w:t>nr_anno_atto</w:t>
             </w:r>
-            <w:proofErr w:type="spellEnd"/>
           </w:p>
         </w:tc>
         <w:tc>
@@ -8303,21 +8220,12 @@
                 <w:lang w:val="it-IT"/>
               </w:rPr>
             </w:pPr>
-            <w:proofErr w:type="gramStart"/>
-            <w:r>
-              <w:rPr>
-                <w:sz w:val="18"/>
-                <w:lang w:val="it-IT"/>
-              </w:rPr>
-              <w:t>NUMBER(</w:t>
-            </w:r>
-            <w:proofErr w:type="gramEnd"/>
-            <w:r>
-              <w:rPr>
-                <w:sz w:val="18"/>
-                <w:lang w:val="it-IT"/>
-              </w:rPr>
-              <w:t>4)</w:t>
+            <w:r>
+              <w:rPr>
+                <w:sz w:val="18"/>
+                <w:lang w:val="it-IT"/>
+              </w:rPr>
+              <w:t>NUMBER(4)</w:t>
             </w:r>
           </w:p>
         </w:tc>
@@ -8374,7 +8282,6 @@
                 <w:lang w:val="it-IT"/>
               </w:rPr>
             </w:pPr>
-            <w:proofErr w:type="spellStart"/>
             <w:r>
               <w:rPr>
                 <w:sz w:val="18"/>
@@ -8382,7 +8289,6 @@
               </w:rPr>
               <w:t>cd_stato_numero_prenotato</w:t>
             </w:r>
-            <w:proofErr w:type="spellEnd"/>
           </w:p>
         </w:tc>
         <w:tc>
@@ -8396,21 +8302,12 @@
                 <w:lang w:val="it-IT"/>
               </w:rPr>
             </w:pPr>
-            <w:proofErr w:type="gramStart"/>
-            <w:r>
-              <w:rPr>
-                <w:sz w:val="18"/>
-                <w:lang w:val="it-IT"/>
-              </w:rPr>
-              <w:t>CHAR(</w:t>
-            </w:r>
-            <w:proofErr w:type="gramEnd"/>
-            <w:r>
-              <w:rPr>
-                <w:sz w:val="18"/>
-                <w:lang w:val="it-IT"/>
-              </w:rPr>
-              <w:t>1)</w:t>
+            <w:r>
+              <w:rPr>
+                <w:sz w:val="18"/>
+                <w:lang w:val="it-IT"/>
+              </w:rPr>
+              <w:t>CHAR(1)</w:t>
             </w:r>
           </w:p>
         </w:tc>
@@ -8467,7 +8364,6 @@
                 <w:lang w:val="it-IT"/>
               </w:rPr>
             </w:pPr>
-            <w:proofErr w:type="spellStart"/>
             <w:r>
               <w:rPr>
                 <w:sz w:val="18"/>
@@ -8475,7 +8371,6 @@
               </w:rPr>
               <w:t>id_ansc_collegato</w:t>
             </w:r>
-            <w:proofErr w:type="spellEnd"/>
           </w:p>
         </w:tc>
         <w:tc>
@@ -8551,7 +8446,6 @@
                 <w:lang w:val="it-IT"/>
               </w:rPr>
             </w:pPr>
-            <w:proofErr w:type="spellStart"/>
             <w:r>
               <w:rPr>
                 <w:sz w:val="18"/>
@@ -8559,7 +8453,6 @@
               </w:rPr>
               <w:t>id_atto_sipo</w:t>
             </w:r>
-            <w:proofErr w:type="spellEnd"/>
           </w:p>
         </w:tc>
         <w:tc>
@@ -8598,23 +8491,7 @@
                 <w:sz w:val="18"/>
                 <w:lang w:val="it-IT"/>
               </w:rPr>
-              <w:t xml:space="preserve">L’atto di SIPO (in Side </w:t>
-            </w:r>
-            <w:proofErr w:type="spellStart"/>
-            <w:r>
-              <w:rPr>
-                <w:sz w:val="18"/>
-                <w:lang w:val="it-IT"/>
-              </w:rPr>
-              <w:t>id_evento</w:t>
-            </w:r>
-            <w:proofErr w:type="spellEnd"/>
-            <w:r>
-              <w:rPr>
-                <w:sz w:val="18"/>
-                <w:lang w:val="it-IT"/>
-              </w:rPr>
-              <w:t>)</w:t>
+              <w:t>L’atto di SIPO (in Side id_evento)</w:t>
             </w:r>
           </w:p>
         </w:tc>
@@ -8651,31 +8528,13 @@
                 <w:lang w:val="it-IT"/>
               </w:rPr>
             </w:pPr>
-            <w:proofErr w:type="spellStart"/>
-            <w:r>
-              <w:rPr>
-                <w:sz w:val="18"/>
-                <w:lang w:val="it-IT"/>
-              </w:rPr>
-              <w:t>ts_allineamento_ansc_side</w:t>
-            </w:r>
-            <w:proofErr w:type="spellEnd"/>
-            <w:r>
-              <w:rPr>
-                <w:sz w:val="18"/>
-                <w:lang w:val="it-IT"/>
-              </w:rPr>
-              <w:t xml:space="preserve"> / </w:t>
-            </w:r>
-            <w:proofErr w:type="spellStart"/>
-            <w:r>
-              <w:rPr>
-                <w:sz w:val="18"/>
-                <w:lang w:val="it-IT"/>
-              </w:rPr>
-              <w:t>cd_operatore_allineamento</w:t>
-            </w:r>
-            <w:proofErr w:type="spellEnd"/>
+            <w:r>
+              <w:rPr>
+                <w:sz w:val="18"/>
+                <w:lang w:val="it-IT"/>
+              </w:rPr>
+              <w:t>ts_allineamento_ansc_side / cd_operatore_allineamento</w:t>
+            </w:r>
           </w:p>
         </w:tc>
         <w:tc>
@@ -8756,12 +8615,12 @@
           <w:lang w:val="it-IT"/>
         </w:rPr>
       </w:pPr>
-      <w:bookmarkStart w:id="18" w:name="_Toc243571239"/>
-      <w:r>
-        <w:rPr>
-          <w:lang w:val="it-IT"/>
-        </w:rPr>
-        <w:t>La serie</w:t>
+      <w:bookmarkStart w:id="18" w:name="_Toc243635733"/>
+      <w:r>
+        <w:rPr>
+          <w:lang w:val="it-IT"/>
+        </w:rPr>
+        <w:t>NUMERATORE_COMUNALE</w:t>
       </w:r>
       <w:bookmarkEnd w:id="18"/>
     </w:p>
@@ -8776,67 +8635,936 @@
         <w:rPr>
           <w:lang w:val="it-IT"/>
         </w:rPr>
-        <w:t>Una sequence per anno, creata il 1° dicembre per l’anno successivo da JOB_CREA_SEQ_NUM_COMUNALE, che esegue PRC_CREA_SEQ_NUM_COMUNALE; la stessa procedura si esegue all’installazione per l’anno in corso. Lo stacco non crea mai una sequence: se manca, fallisce.</w:t>
-      </w:r>
-    </w:p>
-    <w:p>
-      <w:pPr>
-        <w:spacing w:after="0"/>
-        <w:jc w:val="both"/>
-        <w:rPr>
-          <w:lang w:val="it-IT"/>
-        </w:rPr>
+        <w:t xml:space="preserve">Una </w:t>
+      </w:r>
+      <w:r>
+        <w:rPr>
+          <w:lang w:val="it-IT"/>
+        </w:rPr>
+        <w:t>tabella organizzata</w:t>
+      </w:r>
+      <w:r>
+        <w:rPr>
+          <w:lang w:val="it-IT"/>
+        </w:rPr>
+        <w:t xml:space="preserve"> per anno che </w:t>
+      </w:r>
+      <w:r>
+        <w:rPr>
+          <w:lang w:val="it-IT"/>
+        </w:rPr>
+        <w:t>permette di ottenere un numero o più numeri</w:t>
+      </w:r>
+      <w:r>
+        <w:rPr>
+          <w:lang w:val="it-IT"/>
+        </w:rPr>
+        <w:t xml:space="preserve">; Lo stacco </w:t>
+      </w:r>
+      <w:r>
+        <w:rPr>
+          <w:lang w:val="it-IT"/>
+        </w:rPr>
+        <w:t xml:space="preserve">di uno o più numeri </w:t>
+      </w:r>
+      <w:r>
+        <w:rPr>
+          <w:lang w:val="it-IT"/>
+        </w:rPr>
+        <w:t xml:space="preserve">non </w:t>
+      </w:r>
+      <w:r>
+        <w:rPr>
+          <w:lang w:val="it-IT"/>
+        </w:rPr>
+        <w:t xml:space="preserve">deve </w:t>
+      </w:r>
+      <w:r>
+        <w:rPr>
+          <w:lang w:val="it-IT"/>
+        </w:rPr>
+        <w:t>crea</w:t>
+      </w:r>
+      <w:r>
+        <w:rPr>
+          <w:lang w:val="it-IT"/>
+        </w:rPr>
+        <w:t>re</w:t>
+      </w:r>
+      <w:r>
+        <w:rPr>
+          <w:lang w:val="it-IT"/>
+        </w:rPr>
+        <w:t xml:space="preserve"> mai un</w:t>
+      </w:r>
+      <w:r>
+        <w:rPr>
+          <w:lang w:val="it-IT"/>
+        </w:rPr>
+        <w:t xml:space="preserve"> blocco</w:t>
+      </w:r>
+      <w:r>
+        <w:rPr>
+          <w:lang w:val="it-IT"/>
+        </w:rPr>
+        <w:t>.</w:t>
+      </w:r>
+    </w:p>
+    <w:p>
+      <w:pPr>
+        <w:jc w:val="both"/>
+        <w:rPr>
+          <w:lang w:val="it-IT"/>
+        </w:rPr>
+      </w:pPr>
+      <w:r>
+        <w:rPr>
+          <w:lang w:val="it-IT"/>
+        </w:rPr>
+        <w:t>Questa tabella sarà usata sia per le attività normali per permettere la registrazione in ANSC che per le attività esterne a SIPO come, ad esempio, la codifica di atti con la WebApp.</w:t>
+      </w:r>
+    </w:p>
+    <w:p>
+      <w:pPr>
+        <w:pStyle w:val="Titolo2"/>
+        <w:rPr>
+          <w:lang w:val="it-IT"/>
+        </w:rPr>
+      </w:pPr>
+      <w:bookmarkStart w:id="19" w:name="_Toc243635033"/>
+      <w:bookmarkStart w:id="20" w:name="_Toc243635734"/>
+      <w:r>
+        <w:rPr>
+          <w:lang w:val="it-IT"/>
+        </w:rPr>
+        <w:lastRenderedPageBreak/>
+        <w:t xml:space="preserve">Le tabelle della </w:t>
+      </w:r>
+      <w:r>
+        <w:rPr>
+          <w:lang w:val="it-IT"/>
+        </w:rPr>
+        <w:t>Numerazione Comunale</w:t>
+      </w:r>
+      <w:bookmarkEnd w:id="19"/>
+      <w:bookmarkEnd w:id="20"/>
+    </w:p>
+    <w:p>
+      <w:pPr>
+        <w:pStyle w:val="Titolo3"/>
+      </w:pPr>
+      <w:bookmarkStart w:id="21" w:name="_Toc243635034"/>
+      <w:bookmarkStart w:id="22" w:name="_Toc243635735"/>
+      <w:r>
+        <w:t>NUMERATORE_COMUNALE</w:t>
+      </w:r>
+      <w:bookmarkEnd w:id="21"/>
+      <w:bookmarkEnd w:id="22"/>
+    </w:p>
+    <w:p>
+      <w:pPr>
+        <w:spacing w:after="0" w:line="240" w:lineRule="auto"/>
+        <w:jc w:val="both"/>
       </w:pPr>
       <w:r>
         <w:rPr>
           <w:rFonts w:ascii="Courier New" w:hAnsi="Courier New"/>
           <w:sz w:val="16"/>
-          <w:lang w:val="it-IT"/>
-        </w:rPr>
-        <w:t>CREATE SEQUENCE ANSC_USR.SEQ_NUM_COMUNALE_2027</w:t>
-      </w:r>
-    </w:p>
-    <w:p>
-      <w:pPr>
-        <w:spacing w:after="0"/>
-        <w:jc w:val="both"/>
-        <w:rPr>
-          <w:lang w:val="it-IT"/>
-        </w:rPr>
+        </w:rPr>
+        <w:t>CREATE TABLE ANSC_USR.NUMERATORE_COMUNALE (</w:t>
+      </w:r>
+    </w:p>
+    <w:p>
+      <w:pPr>
+        <w:spacing w:after="0" w:line="240" w:lineRule="auto"/>
+        <w:jc w:val="both"/>
       </w:pPr>
       <w:r>
         <w:rPr>
           <w:rFonts w:ascii="Courier New" w:hAnsi="Courier New"/>
           <w:sz w:val="16"/>
-          <w:lang w:val="it-IT"/>
-        </w:rPr>
-        <w:t xml:space="preserve">  START WITH 1 INCREMENT BY 1 MAXVALUE 999999</w:t>
-      </w:r>
-    </w:p>
-    <w:p>
-      <w:pPr>
-        <w:spacing w:after="0"/>
-        <w:jc w:val="both"/>
-        <w:rPr>
-          <w:lang w:val="it-IT"/>
-        </w:rPr>
+        </w:rPr>
+        <w:t xml:space="preserve">  id_anno_documento    NUMBER             NOT NULL,</w:t>
+      </w:r>
+    </w:p>
+    <w:p>
+      <w:pPr>
+        <w:spacing w:after="0" w:line="240" w:lineRule="auto"/>
+        <w:jc w:val="both"/>
       </w:pPr>
       <w:r>
         <w:rPr>
           <w:rFonts w:ascii="Courier New" w:hAnsi="Courier New"/>
           <w:sz w:val="16"/>
-          <w:lang w:val="it-IT"/>
-        </w:rPr>
-        <w:t xml:space="preserve">  NOCACHE ORDER NOCYCLE;</w:t>
-      </w:r>
-    </w:p>
-    <w:p>
-      <w:pPr>
-        <w:jc w:val="both"/>
-        <w:rPr>
-          <w:lang w:val="it-IT"/>
-        </w:rPr>
-      </w:pPr>
+        </w:rPr>
+        <w:t xml:space="preserve">  pg_atto              NUMBER(6,0).       NOT NULL,</w:t>
+      </w:r>
+    </w:p>
+    <w:p>
+      <w:pPr>
+        <w:spacing w:after="0" w:line="240" w:lineRule="auto"/>
+        <w:jc w:val="both"/>
+      </w:pPr>
+      <w:r>
+        <w:rPr>
+          <w:rFonts w:ascii="Courier New" w:hAnsi="Courier New"/>
+          <w:sz w:val="16"/>
+        </w:rPr>
+        <w:t xml:space="preserve">  dt_inserimento       TIMESTAMP,</w:t>
+      </w:r>
+    </w:p>
+    <w:p>
+      <w:pPr>
+        <w:spacing w:after="0" w:line="240" w:lineRule="auto"/>
+        <w:jc w:val="both"/>
+      </w:pPr>
+      <w:r>
+        <w:rPr>
+          <w:rFonts w:ascii="Courier New" w:hAnsi="Courier New"/>
+          <w:sz w:val="16"/>
+        </w:rPr>
+        <w:t xml:space="preserve">  dt_aggiornamento     TIMESTAMP,</w:t>
+      </w:r>
+    </w:p>
+    <w:p>
+      <w:pPr>
+        <w:spacing w:after="0" w:line="240" w:lineRule="auto"/>
+        <w:jc w:val="both"/>
+      </w:pPr>
+      <w:r>
+        <w:rPr>
+          <w:rFonts w:ascii="Courier New" w:hAnsi="Courier New"/>
+          <w:sz w:val="16"/>
+        </w:rPr>
+        <w:t xml:space="preserve">  nr_ordinamento       NUMBER,</w:t>
+      </w:r>
+    </w:p>
+    <w:p>
+      <w:pPr>
+        <w:spacing w:after="0" w:line="240" w:lineRule="auto"/>
+        <w:jc w:val="both"/>
+      </w:pPr>
+      <w:r>
+        <w:rPr>
+          <w:rFonts w:ascii="Courier New" w:hAnsi="Courier New"/>
+          <w:sz w:val="16"/>
+        </w:rPr>
+        <w:t>) TABLESPACE ANSC_USR;</w:t>
+      </w:r>
+    </w:p>
+    <w:p>
+      <w:pPr>
+        <w:jc w:val="both"/>
+      </w:pPr>
+    </w:p>
+    <w:p>
+      <w:pPr>
+        <w:pStyle w:val="Titolo3"/>
+      </w:pPr>
+      <w:bookmarkStart w:id="23" w:name="_Toc243635010"/>
+      <w:bookmarkStart w:id="24" w:name="_Toc243635736"/>
+      <w:r>
+        <w:t>PRENOTAZIONE_ATTI</w:t>
+      </w:r>
+      <w:bookmarkEnd w:id="23"/>
+      <w:bookmarkEnd w:id="24"/>
+    </w:p>
+    <w:p>
+      <w:pPr>
+        <w:spacing w:after="0" w:line="240" w:lineRule="auto"/>
+        <w:jc w:val="both"/>
+        <w:rPr>
+          <w:rFonts w:ascii="Courier New" w:hAnsi="Courier New"/>
+          <w:sz w:val="16"/>
+        </w:rPr>
+      </w:pPr>
+      <w:r>
+        <w:rPr>
+          <w:rFonts w:ascii="Courier New" w:hAnsi="Courier New"/>
+          <w:sz w:val="16"/>
+        </w:rPr>
+        <w:t>CREATE TABLE ANSC_USR.PRENOTAZIONE_ATTI (</w:t>
+      </w:r>
+    </w:p>
+    <w:p>
+      <w:pPr>
+        <w:spacing w:after="0" w:line="240" w:lineRule="auto"/>
+        <w:jc w:val="both"/>
+        <w:rPr>
+          <w:rFonts w:ascii="Courier New" w:hAnsi="Courier New"/>
+          <w:sz w:val="16"/>
+        </w:rPr>
+      </w:pPr>
+      <w:r>
+        <w:rPr>
+          <w:rFonts w:ascii="Courier New" w:hAnsi="Courier New"/>
+          <w:sz w:val="16"/>
+        </w:rPr>
+        <w:t xml:space="preserve">  id_prenotazione_atti      NUMBER GENERATED ALWAYS AS IDENTITY,</w:t>
+      </w:r>
+    </w:p>
+    <w:p>
+      <w:pPr>
+        <w:spacing w:after="0" w:line="240" w:lineRule="auto"/>
+        <w:jc w:val="both"/>
+        <w:rPr>
+          <w:rFonts w:ascii="Courier New" w:hAnsi="Courier New"/>
+          <w:sz w:val="16"/>
+        </w:rPr>
+      </w:pPr>
+      <w:r>
+        <w:rPr>
+          <w:rFonts w:ascii="Courier New" w:hAnsi="Courier New"/>
+          <w:sz w:val="16"/>
+        </w:rPr>
+        <w:t xml:space="preserve">  nr_anno_atto              NUMBER(4)          NOT NULL,</w:t>
+      </w:r>
+    </w:p>
+    <w:p>
+      <w:pPr>
+        <w:spacing w:after="0" w:line="240" w:lineRule="auto"/>
+        <w:jc w:val="both"/>
+        <w:rPr>
+          <w:rFonts w:ascii="Courier New" w:hAnsi="Courier New"/>
+          <w:sz w:val="16"/>
+        </w:rPr>
+      </w:pPr>
+      <w:r>
+        <w:rPr>
+          <w:rFonts w:ascii="Courier New" w:hAnsi="Courier New"/>
+          <w:sz w:val="16"/>
+        </w:rPr>
+        <w:t xml:space="preserve">  nr_id_ansc_da_prenotare   NUMBER(3)          NOT NULL,</w:t>
+      </w:r>
+    </w:p>
+    <w:p>
+      <w:pPr>
+        <w:spacing w:after="0" w:line="240" w:lineRule="auto"/>
+        <w:jc w:val="both"/>
+        <w:rPr>
+          <w:rFonts w:ascii="Courier New" w:hAnsi="Courier New"/>
+          <w:sz w:val="16"/>
+        </w:rPr>
+      </w:pPr>
+      <w:r>
+        <w:rPr>
+          <w:rFonts w:ascii="Courier New" w:hAnsi="Courier New"/>
+          <w:sz w:val="16"/>
+        </w:rPr>
+        <w:t xml:space="preserve">  cd_operatore_prenotazione VARCHAR2(40 CHAR)  NOT NULL,</w:t>
+      </w:r>
+    </w:p>
+    <w:p>
+      <w:pPr>
+        <w:spacing w:after="0" w:line="240" w:lineRule="auto"/>
+        <w:jc w:val="both"/>
+        <w:rPr>
+          <w:rFonts w:ascii="Courier New" w:hAnsi="Courier New"/>
+          <w:sz w:val="16"/>
+        </w:rPr>
+      </w:pPr>
+      <w:r>
+        <w:rPr>
+          <w:rFonts w:ascii="Courier New" w:hAnsi="Courier New"/>
+          <w:sz w:val="16"/>
+        </w:rPr>
+        <w:t xml:space="preserve">  ts_prenotazione           TIMESTAMP DEFAULT SYSTIMESTAMP NOT NULL,</w:t>
+      </w:r>
+    </w:p>
+    <w:p>
+      <w:pPr>
+        <w:spacing w:after="0" w:line="240" w:lineRule="auto"/>
+        <w:jc w:val="both"/>
+        <w:rPr>
+          <w:rFonts w:ascii="Courier New" w:hAnsi="Courier New"/>
+          <w:sz w:val="16"/>
+        </w:rPr>
+      </w:pPr>
+      <w:r>
+        <w:rPr>
+          <w:rFonts w:ascii="Courier New" w:hAnsi="Courier New"/>
+          <w:sz w:val="16"/>
+        </w:rPr>
+        <w:t xml:space="preserve">  CONSTRAINT prenotazione_atti_pk PRIMARY KEY (id_prenotazione_atti),</w:t>
+      </w:r>
+    </w:p>
+    <w:p>
+      <w:pPr>
+        <w:spacing w:after="0" w:line="240" w:lineRule="auto"/>
+        <w:jc w:val="both"/>
+        <w:rPr>
+          <w:rFonts w:ascii="Courier New" w:hAnsi="Courier New"/>
+          <w:sz w:val="16"/>
+        </w:rPr>
+      </w:pPr>
+      <w:r>
+        <w:rPr>
+          <w:rFonts w:ascii="Courier New" w:hAnsi="Courier New"/>
+          <w:sz w:val="16"/>
+        </w:rPr>
+        <w:t xml:space="preserve">  CONSTRAINT prenotazione_atti_qta_ck CHECK (nr_id_ansc_da_prenotare &gt;= 1),</w:t>
+      </w:r>
+    </w:p>
+    <w:p>
+      <w:pPr>
+        <w:spacing w:after="0" w:line="240" w:lineRule="auto"/>
+        <w:jc w:val="both"/>
+        <w:rPr>
+          <w:rFonts w:ascii="Courier New" w:hAnsi="Courier New"/>
+          <w:sz w:val="16"/>
+        </w:rPr>
+      </w:pPr>
+      <w:r>
+        <w:rPr>
+          <w:rFonts w:ascii="Courier New" w:hAnsi="Courier New"/>
+          <w:sz w:val="16"/>
+        </w:rPr>
+        <w:t xml:space="preserve">  CONSTRAINT prenotazione_atti_anno_ck CHECK (nr_anno_atto BETWEEN 2023 AND 9999)</w:t>
+      </w:r>
+    </w:p>
+    <w:p>
+      <w:pPr>
+        <w:spacing w:after="0" w:line="240" w:lineRule="auto"/>
+        <w:jc w:val="both"/>
+        <w:rPr>
+          <w:rFonts w:ascii="Courier New" w:hAnsi="Courier New"/>
+          <w:sz w:val="16"/>
+        </w:rPr>
+      </w:pPr>
+      <w:r>
+        <w:rPr>
+          <w:rFonts w:ascii="Courier New" w:hAnsi="Courier New"/>
+          <w:sz w:val="16"/>
+        </w:rPr>
+        <w:t>) TABLESPACE ANSC_USR;</w:t>
+      </w:r>
+    </w:p>
+    <w:p>
+      <w:pPr>
+        <w:jc w:val="both"/>
+      </w:pPr>
+    </w:p>
+    <w:p>
+      <w:pPr>
+        <w:pStyle w:val="Titolo3"/>
+      </w:pPr>
+      <w:bookmarkStart w:id="25" w:name="_Toc243635011"/>
+      <w:bookmarkStart w:id="26" w:name="_Toc243635737"/>
+      <w:r>
+        <w:t>DATI_ATTO_ESTERNO</w:t>
+      </w:r>
+      <w:bookmarkEnd w:id="25"/>
+      <w:bookmarkEnd w:id="26"/>
+    </w:p>
+    <w:p>
+      <w:pPr>
+        <w:spacing w:after="0" w:line="240" w:lineRule="auto"/>
+        <w:jc w:val="both"/>
+        <w:rPr>
+          <w:rFonts w:ascii="Courier New" w:hAnsi="Courier New"/>
+          <w:sz w:val="16"/>
+        </w:rPr>
+      </w:pPr>
+      <w:r>
+        <w:rPr>
+          <w:rFonts w:ascii="Courier New" w:hAnsi="Courier New"/>
+          <w:sz w:val="16"/>
+        </w:rPr>
+        <w:t>CREATE TABLE ANSC_USR.DATI_ATTO_ESTERNO (</w:t>
+      </w:r>
+    </w:p>
+    <w:p>
+      <w:pPr>
+        <w:spacing w:after="0" w:line="240" w:lineRule="auto"/>
+        <w:jc w:val="both"/>
+        <w:rPr>
+          <w:rFonts w:ascii="Courier New" w:hAnsi="Courier New"/>
+          <w:sz w:val="16"/>
+        </w:rPr>
+      </w:pPr>
+      <w:r>
+        <w:rPr>
+          <w:rFonts w:ascii="Courier New" w:hAnsi="Courier New"/>
+          <w:sz w:val="16"/>
+        </w:rPr>
+        <w:t xml:space="preserve">  id_prenotazione_atti      NUMBER             NOT NULL,</w:t>
+      </w:r>
+    </w:p>
+    <w:p>
+      <w:pPr>
+        <w:spacing w:after="0" w:line="240" w:lineRule="auto"/>
+        <w:jc w:val="both"/>
+        <w:rPr>
+          <w:rFonts w:ascii="Courier New" w:hAnsi="Courier New"/>
+          <w:sz w:val="16"/>
+        </w:rPr>
+      </w:pPr>
+      <w:r>
+        <w:rPr>
+          <w:rFonts w:ascii="Courier New" w:hAnsi="Courier New"/>
+          <w:sz w:val="16"/>
+        </w:rPr>
+        <w:t xml:space="preserve">  nr_atto_comunale          NUMBER(6)          NOT NULL,</w:t>
+      </w:r>
+    </w:p>
+    <w:p>
+      <w:pPr>
+        <w:spacing w:after="0" w:line="240" w:lineRule="auto"/>
+        <w:jc w:val="both"/>
+        <w:rPr>
+          <w:rFonts w:ascii="Courier New" w:hAnsi="Courier New"/>
+          <w:sz w:val="16"/>
+        </w:rPr>
+      </w:pPr>
+      <w:r>
+        <w:rPr>
+          <w:rFonts w:ascii="Courier New" w:hAnsi="Courier New"/>
+          <w:sz w:val="16"/>
+        </w:rPr>
+        <w:t xml:space="preserve">  nr_anno_atto              NUMBER(4)          NOT NULL,</w:t>
+      </w:r>
+    </w:p>
+    <w:p>
+      <w:pPr>
+        <w:spacing w:after="0" w:line="240" w:lineRule="auto"/>
+        <w:jc w:val="both"/>
+        <w:rPr>
+          <w:rFonts w:ascii="Courier New" w:hAnsi="Courier New"/>
+          <w:sz w:val="16"/>
+        </w:rPr>
+      </w:pPr>
+      <w:r>
+        <w:rPr>
+          <w:rFonts w:ascii="Courier New" w:hAnsi="Courier New"/>
+          <w:sz w:val="16"/>
+        </w:rPr>
+        <w:t xml:space="preserve">  cd_stato_numero_prenotato CHAR(1 CHAR) DEFAULT '1' NOT NULL,</w:t>
+      </w:r>
+    </w:p>
+    <w:p>
+      <w:pPr>
+        <w:spacing w:after="0" w:line="240" w:lineRule="auto"/>
+        <w:jc w:val="both"/>
+        <w:rPr>
+          <w:rFonts w:ascii="Courier New" w:hAnsi="Courier New"/>
+          <w:sz w:val="16"/>
+        </w:rPr>
+      </w:pPr>
+      <w:r>
+        <w:rPr>
+          <w:rFonts w:ascii="Courier New" w:hAnsi="Courier New"/>
+          <w:sz w:val="16"/>
+        </w:rPr>
+        <w:t xml:space="preserve">  id_ansc_collegato         VARCHAR2(50 CHAR),</w:t>
+      </w:r>
+    </w:p>
+    <w:p>
+      <w:pPr>
+        <w:spacing w:after="0" w:line="240" w:lineRule="auto"/>
+        <w:jc w:val="both"/>
+        <w:rPr>
+          <w:rFonts w:ascii="Courier New" w:hAnsi="Courier New"/>
+          <w:sz w:val="16"/>
+        </w:rPr>
+      </w:pPr>
+      <w:r>
+        <w:rPr>
+          <w:rFonts w:ascii="Courier New" w:hAnsi="Courier New"/>
+          <w:sz w:val="16"/>
+        </w:rPr>
+        <w:t xml:space="preserve">  id_atto_sipo              NUMBER,</w:t>
+      </w:r>
+    </w:p>
+    <w:p>
+      <w:pPr>
+        <w:spacing w:after="0" w:line="240" w:lineRule="auto"/>
+        <w:jc w:val="both"/>
+        <w:rPr>
+          <w:rFonts w:ascii="Courier New" w:hAnsi="Courier New"/>
+          <w:sz w:val="16"/>
+        </w:rPr>
+      </w:pPr>
+      <w:r>
+        <w:rPr>
+          <w:rFonts w:ascii="Courier New" w:hAnsi="Courier New"/>
+          <w:sz w:val="16"/>
+        </w:rPr>
+        <w:t xml:space="preserve">  ts_allineamento_ansc_side TIMESTAMP,</w:t>
+      </w:r>
+    </w:p>
+    <w:p>
+      <w:pPr>
+        <w:spacing w:after="0" w:line="240" w:lineRule="auto"/>
+        <w:jc w:val="both"/>
+        <w:rPr>
+          <w:rFonts w:ascii="Courier New" w:hAnsi="Courier New"/>
+          <w:sz w:val="16"/>
+        </w:rPr>
+      </w:pPr>
+      <w:r>
+        <w:rPr>
+          <w:rFonts w:ascii="Courier New" w:hAnsi="Courier New"/>
+          <w:sz w:val="16"/>
+        </w:rPr>
+        <w:t xml:space="preserve">  cd_operatore_allineamento VARCHAR2(40 CHAR),</w:t>
+      </w:r>
+    </w:p>
+    <w:p>
+      <w:pPr>
+        <w:spacing w:after="0" w:line="240" w:lineRule="auto"/>
+        <w:jc w:val="both"/>
+        <w:rPr>
+          <w:rFonts w:ascii="Courier New" w:hAnsi="Courier New"/>
+          <w:sz w:val="16"/>
+        </w:rPr>
+      </w:pPr>
+      <w:r>
+        <w:rPr>
+          <w:rFonts w:ascii="Courier New" w:hAnsi="Courier New"/>
+          <w:sz w:val="16"/>
+        </w:rPr>
+        <w:t xml:space="preserve">  CONSTRAINT dati_atto_esterno_pk</w:t>
+      </w:r>
+    </w:p>
+    <w:p>
+      <w:pPr>
+        <w:spacing w:after="0" w:line="240" w:lineRule="auto"/>
+        <w:jc w:val="both"/>
+        <w:rPr>
+          <w:rFonts w:ascii="Courier New" w:hAnsi="Courier New"/>
+          <w:sz w:val="16"/>
+        </w:rPr>
+      </w:pPr>
+      <w:r>
+        <w:rPr>
+          <w:rFonts w:ascii="Courier New" w:hAnsi="Courier New"/>
+          <w:sz w:val="16"/>
+        </w:rPr>
+        <w:t xml:space="preserve">    PRIMARY KEY (id_prenotazione_atti, nr_atto_comunale),</w:t>
+      </w:r>
+    </w:p>
+    <w:p>
+      <w:pPr>
+        <w:spacing w:after="0" w:line="240" w:lineRule="auto"/>
+        <w:jc w:val="both"/>
+        <w:rPr>
+          <w:rFonts w:ascii="Courier New" w:hAnsi="Courier New"/>
+          <w:sz w:val="16"/>
+        </w:rPr>
+      </w:pPr>
+      <w:r>
+        <w:rPr>
+          <w:rFonts w:ascii="Courier New" w:hAnsi="Courier New"/>
+          <w:sz w:val="16"/>
+        </w:rPr>
+        <w:t xml:space="preserve">  CONSTRAINT dati_atto_esterno_serie_uk</w:t>
+      </w:r>
+    </w:p>
+    <w:p>
+      <w:pPr>
+        <w:spacing w:after="0" w:line="240" w:lineRule="auto"/>
+        <w:jc w:val="both"/>
+        <w:rPr>
+          <w:rFonts w:ascii="Courier New" w:hAnsi="Courier New"/>
+          <w:sz w:val="16"/>
+        </w:rPr>
+      </w:pPr>
+      <w:r>
+        <w:rPr>
+          <w:rFonts w:ascii="Courier New" w:hAnsi="Courier New"/>
+          <w:sz w:val="16"/>
+        </w:rPr>
+        <w:t xml:space="preserve">    UNIQUE (nr_anno_atto, nr_atto_comunale),</w:t>
+      </w:r>
+    </w:p>
+    <w:p>
+      <w:pPr>
+        <w:spacing w:after="0" w:line="240" w:lineRule="auto"/>
+        <w:jc w:val="both"/>
+        <w:rPr>
+          <w:rFonts w:ascii="Courier New" w:hAnsi="Courier New"/>
+          <w:sz w:val="16"/>
+        </w:rPr>
+      </w:pPr>
+      <w:r>
+        <w:rPr>
+          <w:rFonts w:ascii="Courier New" w:hAnsi="Courier New"/>
+          <w:sz w:val="16"/>
+        </w:rPr>
+        <w:t xml:space="preserve">  CONSTRAINT dati_atto_esterno_pren_fk FOREIGN KEY (id_prenotazione_atti)</w:t>
+      </w:r>
+    </w:p>
+    <w:p>
+      <w:pPr>
+        <w:spacing w:after="0" w:line="240" w:lineRule="auto"/>
+        <w:jc w:val="both"/>
+        <w:rPr>
+          <w:rFonts w:ascii="Courier New" w:hAnsi="Courier New"/>
+          <w:sz w:val="16"/>
+        </w:rPr>
+      </w:pPr>
+      <w:r>
+        <w:rPr>
+          <w:rFonts w:ascii="Courier New" w:hAnsi="Courier New"/>
+          <w:sz w:val="16"/>
+        </w:rPr>
+        <w:t xml:space="preserve">    REFERENCES ANSC_USR.PRENOTAZIONE_ATTI (id_prenotazione_atti),</w:t>
+      </w:r>
+    </w:p>
+    <w:p>
+      <w:pPr>
+        <w:spacing w:after="0" w:line="240" w:lineRule="auto"/>
+        <w:jc w:val="both"/>
+        <w:rPr>
+          <w:rFonts w:ascii="Courier New" w:hAnsi="Courier New"/>
+          <w:sz w:val="16"/>
+        </w:rPr>
+      </w:pPr>
+      <w:r>
+        <w:rPr>
+          <w:rFonts w:ascii="Courier New" w:hAnsi="Courier New"/>
+          <w:sz w:val="16"/>
+        </w:rPr>
+        <w:t xml:space="preserve">  CONSTRAINT dati_atto_esterno_stato_ck</w:t>
+      </w:r>
+    </w:p>
+    <w:p>
+      <w:pPr>
+        <w:spacing w:after="0" w:line="240" w:lineRule="auto"/>
+        <w:jc w:val="both"/>
+        <w:rPr>
+          <w:rFonts w:ascii="Courier New" w:hAnsi="Courier New"/>
+          <w:sz w:val="16"/>
+        </w:rPr>
+      </w:pPr>
+      <w:r>
+        <w:rPr>
+          <w:rFonts w:ascii="Courier New" w:hAnsi="Courier New"/>
+          <w:sz w:val="16"/>
+        </w:rPr>
+        <w:t xml:space="preserve">    CHECK (cd_stato_numero_prenotato IN ('1','2','3','4'))</w:t>
+      </w:r>
+    </w:p>
+    <w:p>
+      <w:pPr>
+        <w:spacing w:after="0" w:line="240" w:lineRule="auto"/>
+        <w:jc w:val="both"/>
+        <w:rPr>
+          <w:rFonts w:ascii="Courier New" w:hAnsi="Courier New"/>
+          <w:sz w:val="16"/>
+        </w:rPr>
+      </w:pPr>
+      <w:r>
+        <w:rPr>
+          <w:rFonts w:ascii="Courier New" w:hAnsi="Courier New"/>
+          <w:sz w:val="16"/>
+        </w:rPr>
+        <w:t>) TABLESPACE ANSC_USR;</w:t>
+      </w:r>
+    </w:p>
+    <w:p>
+      <w:pPr>
+        <w:spacing w:after="0" w:line="240" w:lineRule="auto"/>
+        <w:jc w:val="both"/>
+        <w:rPr>
+          <w:rFonts w:ascii="Courier New" w:hAnsi="Courier New"/>
+          <w:sz w:val="16"/>
+        </w:rPr>
+      </w:pPr>
+      <w:r>
+        <w:rPr>
+          <w:rFonts w:ascii="Courier New" w:hAnsi="Courier New"/>
+          <w:sz w:val="16"/>
+        </w:rPr>
+        <w:t>CREATE INDEX ANSC_USR.IX_DATI_ATTO_ESTERNO_ATTO</w:t>
+      </w:r>
+    </w:p>
+    <w:p>
+      <w:pPr>
+        <w:spacing w:after="0" w:line="240" w:lineRule="auto"/>
+        <w:jc w:val="both"/>
+        <w:rPr>
+          <w:rFonts w:ascii="Courier New" w:hAnsi="Courier New"/>
+          <w:sz w:val="16"/>
+        </w:rPr>
+      </w:pPr>
+      <w:r>
+        <w:rPr>
+          <w:rFonts w:ascii="Courier New" w:hAnsi="Courier New"/>
+          <w:sz w:val="16"/>
+        </w:rPr>
+        <w:t xml:space="preserve">  ON ANSC_USR.DATI_ATTO_ESTERNO (id_atto_sipo) TABLESPACE ANSC_USR;</w:t>
+      </w:r>
+    </w:p>
+    <w:p>
+      <w:pPr>
+        <w:spacing w:after="0" w:line="240" w:lineRule="auto"/>
+        <w:jc w:val="both"/>
+        <w:rPr>
+          <w:rFonts w:ascii="Courier New" w:hAnsi="Courier New"/>
+          <w:sz w:val="16"/>
+        </w:rPr>
+      </w:pPr>
+      <w:r>
+        <w:rPr>
+          <w:rFonts w:ascii="Courier New" w:hAnsi="Courier New"/>
+          <w:sz w:val="16"/>
+        </w:rPr>
+        <w:t>CREATE INDEX ANSC_USR.IX_PRENOTAZIONE_ATTI_SERIE</w:t>
+      </w:r>
+    </w:p>
+    <w:p>
+      <w:pPr>
+        <w:spacing w:after="0" w:line="240" w:lineRule="auto"/>
+        <w:jc w:val="both"/>
+        <w:rPr>
+          <w:rFonts w:ascii="Courier New" w:hAnsi="Courier New"/>
+          <w:sz w:val="16"/>
+        </w:rPr>
+      </w:pPr>
+      <w:r>
+        <w:rPr>
+          <w:rFonts w:ascii="Courier New" w:hAnsi="Courier New"/>
+          <w:sz w:val="16"/>
+        </w:rPr>
+        <w:t xml:space="preserve">  ON ANSC_USR.PRENOTAZIONE_ATTI (nr_anno_atto, ts_prenotazione)</w:t>
+      </w:r>
+    </w:p>
+    <w:p>
+      <w:pPr>
+        <w:spacing w:after="0" w:line="240" w:lineRule="auto"/>
+        <w:jc w:val="both"/>
+        <w:rPr>
+          <w:rFonts w:ascii="Courier New" w:hAnsi="Courier New"/>
+          <w:sz w:val="16"/>
+        </w:rPr>
+      </w:pPr>
+      <w:r>
+        <w:rPr>
+          <w:rFonts w:ascii="Courier New" w:hAnsi="Courier New"/>
+          <w:sz w:val="16"/>
+        </w:rPr>
+        <w:t xml:space="preserve">  TABLESPACE ANSC_USR;</w:t>
+      </w:r>
+    </w:p>
+    <w:p>
+      <w:pPr>
+        <w:spacing w:after="0" w:line="240" w:lineRule="auto"/>
+        <w:jc w:val="both"/>
+        <w:rPr>
+          <w:rFonts w:ascii="Courier New" w:hAnsi="Courier New"/>
+          <w:sz w:val="16"/>
+        </w:rPr>
+      </w:pPr>
+      <w:r>
+        <w:rPr>
+          <w:rFonts w:ascii="Courier New" w:hAnsi="Courier New"/>
+          <w:sz w:val="16"/>
+        </w:rPr>
+        <w:t>COMMENT ON TABLE ANSC_USR.PRENOTAZIONE_ATTI IS</w:t>
+      </w:r>
+    </w:p>
+    <w:p>
+      <w:pPr>
+        <w:spacing w:after="0" w:line="240" w:lineRule="auto"/>
+        <w:jc w:val="both"/>
+        <w:rPr>
+          <w:rFonts w:ascii="Courier New" w:hAnsi="Courier New"/>
+          <w:sz w:val="16"/>
+        </w:rPr>
+      </w:pPr>
+      <w:r>
+        <w:rPr>
+          <w:rFonts w:ascii="Courier New" w:hAnsi="Courier New"/>
+          <w:sz w:val="16"/>
+        </w:rPr>
+        <w:t xml:space="preserve">  'Richieste di numeri comunali, per anno. Struttura di Side, senza il registro.';</w:t>
+      </w:r>
+    </w:p>
+    <w:p>
+      <w:pPr>
+        <w:spacing w:after="0" w:line="240" w:lineRule="auto"/>
+        <w:jc w:val="both"/>
+        <w:rPr>
+          <w:rFonts w:ascii="Courier New" w:hAnsi="Courier New"/>
+          <w:sz w:val="16"/>
+        </w:rPr>
+      </w:pPr>
+      <w:r>
+        <w:rPr>
+          <w:rFonts w:ascii="Courier New" w:hAnsi="Courier New"/>
+          <w:sz w:val="16"/>
+        </w:rPr>
+        <w:t>COMMENT ON TABLE ANSC_USR.DATI_ATTO_ESTERNO IS</w:t>
+      </w:r>
+    </w:p>
+    <w:p>
+      <w:pPr>
+        <w:spacing w:after="0" w:line="240" w:lineRule="auto"/>
+        <w:jc w:val="both"/>
+        <w:rPr>
+          <w:rFonts w:ascii="Courier New" w:hAnsi="Courier New"/>
+          <w:sz w:val="16"/>
+        </w:rPr>
+      </w:pPr>
+      <w:r>
+        <w:rPr>
+          <w:rFonts w:ascii="Courier New" w:hAnsi="Courier New"/>
+          <w:sz w:val="16"/>
+        </w:rPr>
+        <w:t xml:space="preserve">  'Ogni numero comunale staccato e la sua sorte. Struttura di Side.';</w:t>
+      </w:r>
+    </w:p>
+    <w:p>
+      <w:pPr>
+        <w:spacing w:after="0" w:line="240" w:lineRule="auto"/>
+        <w:jc w:val="both"/>
+        <w:rPr>
+          <w:rFonts w:ascii="Courier New" w:hAnsi="Courier New"/>
+          <w:sz w:val="16"/>
+        </w:rPr>
+      </w:pPr>
+      <w:r>
+        <w:rPr>
+          <w:rFonts w:ascii="Courier New" w:hAnsi="Courier New"/>
+          <w:sz w:val="16"/>
+        </w:rPr>
+        <w:t>COMMENT ON COLUMN ANSC_USR.DATI_ATTO_ESTERNO.cd_stato_numero_prenotato IS</w:t>
+      </w:r>
+    </w:p>
+    <w:p>
+      <w:pPr>
+        <w:spacing w:after="0" w:line="240" w:lineRule="auto"/>
+        <w:jc w:val="both"/>
+        <w:rPr>
+          <w:rFonts w:ascii="Courier New" w:hAnsi="Courier New"/>
+          <w:sz w:val="16"/>
+        </w:rPr>
+      </w:pPr>
+      <w:r>
+        <w:rPr>
+          <w:rFonts w:ascii="Courier New" w:hAnsi="Courier New"/>
+          <w:sz w:val="16"/>
+        </w:rPr>
+        <w:t xml:space="preserve">  '1 Disponibile | 2 Utilizzato | 3 Scartato | 4 Evento acquisito (dominio SIDe_17).';</w:t>
+      </w:r>
+    </w:p>
+    <w:p>
+      <w:pPr>
+        <w:jc w:val="both"/>
+      </w:pPr>
+    </w:p>
+    <w:p>
+      <w:pPr>
+        <w:jc w:val="both"/>
+      </w:pPr>
+      <w:r>
+        <w:rPr>
+          <w:rFonts w:ascii="Courier New" w:hAnsi="Courier New"/>
+          <w:sz w:val="16"/>
+        </w:rPr>
+        <w:t>/</w:t>
+      </w:r>
     </w:p>
     <w:p>
       <w:pPr>
@@ -8846,23 +9574,32 @@
           <w:lang w:val="it-IT"/>
         </w:rPr>
       </w:pPr>
-      <w:bookmarkStart w:id="19" w:name="_Toc243571240"/>
+      <w:bookmarkStart w:id="27" w:name="_Toc243635738"/>
       <w:r>
         <w:rPr>
           <w:lang w:val="it-IT"/>
         </w:rPr>
         <w:lastRenderedPageBreak/>
-        <w:t xml:space="preserve">Il servizio </w:t>
-      </w:r>
-      <w:proofErr w:type="spellStart"/>
-      <w:r>
-        <w:rPr>
-          <w:lang w:val="it-IT"/>
-        </w:rPr>
-        <w:t>num-ansc-sipo</w:t>
-      </w:r>
-      <w:bookmarkEnd w:id="19"/>
-      <w:proofErr w:type="spellEnd"/>
+        <w:t xml:space="preserve">Il </w:t>
+      </w:r>
+      <w:commentRangeStart w:id="28"/>
+      <w:r>
+        <w:rPr>
+          <w:lang w:val="it-IT"/>
+        </w:rPr>
+        <w:t>servizio num-ansc-sipo</w:t>
+      </w:r>
+      <w:bookmarkEnd w:id="27"/>
+      <w:commentRangeEnd w:id="28"/>
+      <w:r>
+        <w:rPr>
+          <w:rStyle w:val="Rimandocommento"/>
+          <w:sz w:val="32"/>
+          <w:szCs w:val="32"/>
+          <w:lang w:val="it-IT"/>
+        </w:rPr>
+        <w:commentReference w:id="28"/>
+      </w:r>
     </w:p>
     <w:p>
       <w:pPr>
@@ -8993,7 +9730,6 @@
                 <w:lang w:val="it-IT"/>
               </w:rPr>
             </w:pPr>
-            <w:proofErr w:type="spellStart"/>
             <w:r>
               <w:rPr>
                 <w:sz w:val="18"/>
@@ -9001,7 +9737,6 @@
               </w:rPr>
               <w:t>creaPrenotazione</w:t>
             </w:r>
-            <w:proofErr w:type="spellEnd"/>
           </w:p>
         </w:tc>
         <w:tc>
@@ -9020,23 +9755,7 @@
                 <w:sz w:val="18"/>
                 <w:lang w:val="it-IT"/>
               </w:rPr>
-              <w:t>POST /</w:t>
-            </w:r>
-            <w:proofErr w:type="spellStart"/>
-            <w:r>
-              <w:rPr>
-                <w:sz w:val="18"/>
-                <w:lang w:val="it-IT"/>
-              </w:rPr>
-              <w:t>ansc</w:t>
-            </w:r>
-            <w:proofErr w:type="spellEnd"/>
-            <w:r>
-              <w:rPr>
-                <w:sz w:val="18"/>
-                <w:lang w:val="it-IT"/>
-              </w:rPr>
-              <w:t>/v1/numerazione/prenotazioni</w:t>
+              <w:t>POST /ansc/v1/numerazione/prenotazioni</w:t>
             </w:r>
           </w:p>
         </w:tc>
@@ -9093,7 +9812,6 @@
                 <w:lang w:val="it-IT"/>
               </w:rPr>
             </w:pPr>
-            <w:proofErr w:type="spellStart"/>
             <w:r>
               <w:rPr>
                 <w:sz w:val="18"/>
@@ -9101,7 +9819,6 @@
               </w:rPr>
               <w:t>elencaPrenotazioni</w:t>
             </w:r>
-            <w:proofErr w:type="spellEnd"/>
           </w:p>
         </w:tc>
         <w:tc>
@@ -9120,23 +9837,7 @@
                 <w:sz w:val="18"/>
                 <w:lang w:val="it-IT"/>
               </w:rPr>
-              <w:t>GET /</w:t>
-            </w:r>
-            <w:proofErr w:type="spellStart"/>
-            <w:r>
-              <w:rPr>
-                <w:sz w:val="18"/>
-                <w:lang w:val="it-IT"/>
-              </w:rPr>
-              <w:t>ansc</w:t>
-            </w:r>
-            <w:proofErr w:type="spellEnd"/>
-            <w:r>
-              <w:rPr>
-                <w:sz w:val="18"/>
-                <w:lang w:val="it-IT"/>
-              </w:rPr>
-              <w:t>/v1/numerazione/prenotazioni</w:t>
+              <w:t>GET /ansc/v1/numerazione/prenotazioni</w:t>
             </w:r>
           </w:p>
         </w:tc>
@@ -9193,7 +9894,6 @@
                 <w:lang w:val="it-IT"/>
               </w:rPr>
             </w:pPr>
-            <w:proofErr w:type="spellStart"/>
             <w:r>
               <w:rPr>
                 <w:sz w:val="18"/>
@@ -9201,7 +9901,6 @@
               </w:rPr>
               <w:t>leggiPrenotazione</w:t>
             </w:r>
-            <w:proofErr w:type="spellEnd"/>
           </w:p>
         </w:tc>
         <w:tc>
@@ -9220,39 +9919,7 @@
                 <w:sz w:val="18"/>
                 <w:lang w:val="it-IT"/>
               </w:rPr>
-              <w:t>GET /</w:t>
-            </w:r>
-            <w:proofErr w:type="spellStart"/>
-            <w:r>
-              <w:rPr>
-                <w:sz w:val="18"/>
-                <w:lang w:val="it-IT"/>
-              </w:rPr>
-              <w:t>ansc</w:t>
-            </w:r>
-            <w:proofErr w:type="spellEnd"/>
-            <w:r>
-              <w:rPr>
-                <w:sz w:val="18"/>
-                <w:lang w:val="it-IT"/>
-              </w:rPr>
-              <w:t>/v1/numerazione/prenotazioni/{</w:t>
-            </w:r>
-            <w:proofErr w:type="spellStart"/>
-            <w:r>
-              <w:rPr>
-                <w:sz w:val="18"/>
-                <w:lang w:val="it-IT"/>
-              </w:rPr>
-              <w:t>idPrenotazione</w:t>
-            </w:r>
-            <w:proofErr w:type="spellEnd"/>
-            <w:r>
-              <w:rPr>
-                <w:sz w:val="18"/>
-                <w:lang w:val="it-IT"/>
-              </w:rPr>
-              <w:t>}</w:t>
+              <w:t>GET /ansc/v1/numerazione/prenotazioni/{idPrenotazione}</w:t>
             </w:r>
           </w:p>
         </w:tc>
@@ -9309,7 +9976,6 @@
                 <w:lang w:val="it-IT"/>
               </w:rPr>
             </w:pPr>
-            <w:proofErr w:type="spellStart"/>
             <w:r>
               <w:rPr>
                 <w:sz w:val="18"/>
@@ -9317,7 +9983,6 @@
               </w:rPr>
               <w:t>elencaSerie</w:t>
             </w:r>
-            <w:proofErr w:type="spellEnd"/>
           </w:p>
         </w:tc>
         <w:tc>
@@ -9336,23 +10001,7 @@
                 <w:sz w:val="18"/>
                 <w:lang w:val="it-IT"/>
               </w:rPr>
-              <w:t>GET /</w:t>
-            </w:r>
-            <w:proofErr w:type="spellStart"/>
-            <w:r>
-              <w:rPr>
-                <w:sz w:val="18"/>
-                <w:lang w:val="it-IT"/>
-              </w:rPr>
-              <w:t>ansc</w:t>
-            </w:r>
-            <w:proofErr w:type="spellEnd"/>
-            <w:r>
-              <w:rPr>
-                <w:sz w:val="18"/>
-                <w:lang w:val="it-IT"/>
-              </w:rPr>
-              <w:t>/v1/numerazione/serie</w:t>
+              <w:t>GET /ansc/v1/numerazione/serie</w:t>
             </w:r>
           </w:p>
         </w:tc>
@@ -9409,7 +10058,6 @@
                 <w:lang w:val="it-IT"/>
               </w:rPr>
             </w:pPr>
-            <w:proofErr w:type="spellStart"/>
             <w:r>
               <w:rPr>
                 <w:sz w:val="18"/>
@@ -9417,7 +10065,6 @@
               </w:rPr>
               <w:t>creaSerie</w:t>
             </w:r>
-            <w:proofErr w:type="spellEnd"/>
           </w:p>
         </w:tc>
         <w:tc>
@@ -9436,23 +10083,7 @@
                 <w:sz w:val="18"/>
                 <w:lang w:val="it-IT"/>
               </w:rPr>
-              <w:t>POST /</w:t>
-            </w:r>
-            <w:proofErr w:type="spellStart"/>
-            <w:r>
-              <w:rPr>
-                <w:sz w:val="18"/>
-                <w:lang w:val="it-IT"/>
-              </w:rPr>
-              <w:t>ansc</w:t>
-            </w:r>
-            <w:proofErr w:type="spellEnd"/>
-            <w:r>
-              <w:rPr>
-                <w:sz w:val="18"/>
-                <w:lang w:val="it-IT"/>
-              </w:rPr>
-              <w:t>/v1/numerazione/serie</w:t>
+              <w:t>POST /ansc/v1/numerazione/serie</w:t>
             </w:r>
           </w:p>
         </w:tc>
@@ -9509,7 +10140,6 @@
                 <w:lang w:val="it-IT"/>
               </w:rPr>
             </w:pPr>
-            <w:proofErr w:type="spellStart"/>
             <w:r>
               <w:rPr>
                 <w:sz w:val="18"/>
@@ -9517,7 +10147,6 @@
               </w:rPr>
               <w:t>leggiSerie</w:t>
             </w:r>
-            <w:proofErr w:type="spellEnd"/>
           </w:p>
         </w:tc>
         <w:tc>
@@ -9536,39 +10165,7 @@
                 <w:sz w:val="18"/>
                 <w:lang w:val="it-IT"/>
               </w:rPr>
-              <w:t>GET /</w:t>
-            </w:r>
-            <w:proofErr w:type="spellStart"/>
-            <w:r>
-              <w:rPr>
-                <w:sz w:val="18"/>
-                <w:lang w:val="it-IT"/>
-              </w:rPr>
-              <w:t>ansc</w:t>
-            </w:r>
-            <w:proofErr w:type="spellEnd"/>
-            <w:r>
-              <w:rPr>
-                <w:sz w:val="18"/>
-                <w:lang w:val="it-IT"/>
-              </w:rPr>
-              <w:t>/v1/numerazione/serie/{</w:t>
-            </w:r>
-            <w:proofErr w:type="spellStart"/>
-            <w:r>
-              <w:rPr>
-                <w:sz w:val="18"/>
-                <w:lang w:val="it-IT"/>
-              </w:rPr>
-              <w:t>numAnno</w:t>
-            </w:r>
-            <w:proofErr w:type="spellEnd"/>
-            <w:r>
-              <w:rPr>
-                <w:sz w:val="18"/>
-                <w:lang w:val="it-IT"/>
-              </w:rPr>
-              <w:t>}</w:t>
+              <w:t>GET /ansc/v1/numerazione/serie/{numAnno}</w:t>
             </w:r>
           </w:p>
         </w:tc>
@@ -9625,7 +10222,6 @@
                 <w:lang w:val="it-IT"/>
               </w:rPr>
             </w:pPr>
-            <w:proofErr w:type="spellStart"/>
             <w:r>
               <w:rPr>
                 <w:sz w:val="18"/>
@@ -9633,7 +10229,6 @@
               </w:rPr>
               <w:t>elencaNumeri</w:t>
             </w:r>
-            <w:proofErr w:type="spellEnd"/>
           </w:p>
         </w:tc>
         <w:tc>
@@ -9652,39 +10247,7 @@
                 <w:sz w:val="18"/>
                 <w:lang w:val="it-IT"/>
               </w:rPr>
-              <w:t>GET /</w:t>
-            </w:r>
-            <w:proofErr w:type="spellStart"/>
-            <w:r>
-              <w:rPr>
-                <w:sz w:val="18"/>
-                <w:lang w:val="it-IT"/>
-              </w:rPr>
-              <w:t>ansc</w:t>
-            </w:r>
-            <w:proofErr w:type="spellEnd"/>
-            <w:r>
-              <w:rPr>
-                <w:sz w:val="18"/>
-                <w:lang w:val="it-IT"/>
-              </w:rPr>
-              <w:t>/v1/numerazione/serie/{</w:t>
-            </w:r>
-            <w:proofErr w:type="spellStart"/>
-            <w:r>
-              <w:rPr>
-                <w:sz w:val="18"/>
-                <w:lang w:val="it-IT"/>
-              </w:rPr>
-              <w:t>numAnno</w:t>
-            </w:r>
-            <w:proofErr w:type="spellEnd"/>
-            <w:r>
-              <w:rPr>
-                <w:sz w:val="18"/>
-                <w:lang w:val="it-IT"/>
-              </w:rPr>
-              <w:t>}/numeri</w:t>
+              <w:t>GET /ansc/v1/numerazione/serie/{numAnno}/numeri</w:t>
             </w:r>
           </w:p>
         </w:tc>
@@ -9741,7 +10304,6 @@
                 <w:lang w:val="it-IT"/>
               </w:rPr>
             </w:pPr>
-            <w:proofErr w:type="spellStart"/>
             <w:r>
               <w:rPr>
                 <w:sz w:val="18"/>
@@ -9749,7 +10311,6 @@
               </w:rPr>
               <w:t>creaNumero</w:t>
             </w:r>
-            <w:proofErr w:type="spellEnd"/>
           </w:p>
         </w:tc>
         <w:tc>
@@ -9768,39 +10329,7 @@
                 <w:sz w:val="18"/>
                 <w:lang w:val="it-IT"/>
               </w:rPr>
-              <w:t>POST /</w:t>
-            </w:r>
-            <w:proofErr w:type="spellStart"/>
-            <w:r>
-              <w:rPr>
-                <w:sz w:val="18"/>
-                <w:lang w:val="it-IT"/>
-              </w:rPr>
-              <w:t>ansc</w:t>
-            </w:r>
-            <w:proofErr w:type="spellEnd"/>
-            <w:r>
-              <w:rPr>
-                <w:sz w:val="18"/>
-                <w:lang w:val="it-IT"/>
-              </w:rPr>
-              <w:t>/v1/numerazione/serie/{</w:t>
-            </w:r>
-            <w:proofErr w:type="spellStart"/>
-            <w:r>
-              <w:rPr>
-                <w:sz w:val="18"/>
-                <w:lang w:val="it-IT"/>
-              </w:rPr>
-              <w:t>numAnno</w:t>
-            </w:r>
-            <w:proofErr w:type="spellEnd"/>
-            <w:r>
-              <w:rPr>
-                <w:sz w:val="18"/>
-                <w:lang w:val="it-IT"/>
-              </w:rPr>
-              <w:t>}/numeri</w:t>
+              <w:t>POST /ansc/v1/numerazione/serie/{numAnno}/numeri</w:t>
             </w:r>
           </w:p>
         </w:tc>
@@ -9857,7 +10386,6 @@
                 <w:lang w:val="it-IT"/>
               </w:rPr>
             </w:pPr>
-            <w:proofErr w:type="spellStart"/>
             <w:r>
               <w:rPr>
                 <w:sz w:val="18"/>
@@ -9865,7 +10393,6 @@
               </w:rPr>
               <w:t>leggiNumero</w:t>
             </w:r>
-            <w:proofErr w:type="spellEnd"/>
           </w:p>
         </w:tc>
         <w:tc>
@@ -9884,55 +10411,7 @@
                 <w:sz w:val="18"/>
                 <w:lang w:val="it-IT"/>
               </w:rPr>
-              <w:t>GET /</w:t>
-            </w:r>
-            <w:proofErr w:type="spellStart"/>
-            <w:r>
-              <w:rPr>
-                <w:sz w:val="18"/>
-                <w:lang w:val="it-IT"/>
-              </w:rPr>
-              <w:t>ansc</w:t>
-            </w:r>
-            <w:proofErr w:type="spellEnd"/>
-            <w:r>
-              <w:rPr>
-                <w:sz w:val="18"/>
-                <w:lang w:val="it-IT"/>
-              </w:rPr>
-              <w:t>/v1/numerazione/serie/{</w:t>
-            </w:r>
-            <w:proofErr w:type="spellStart"/>
-            <w:r>
-              <w:rPr>
-                <w:sz w:val="18"/>
-                <w:lang w:val="it-IT"/>
-              </w:rPr>
-              <w:t>numAnno</w:t>
-            </w:r>
-            <w:proofErr w:type="spellEnd"/>
-            <w:r>
-              <w:rPr>
-                <w:sz w:val="18"/>
-                <w:lang w:val="it-IT"/>
-              </w:rPr>
-              <w:t>}/numeri/{</w:t>
-            </w:r>
-            <w:proofErr w:type="spellStart"/>
-            <w:r>
-              <w:rPr>
-                <w:sz w:val="18"/>
-                <w:lang w:val="it-IT"/>
-              </w:rPr>
-              <w:t>numAtto</w:t>
-            </w:r>
-            <w:proofErr w:type="spellEnd"/>
-            <w:r>
-              <w:rPr>
-                <w:sz w:val="18"/>
-                <w:lang w:val="it-IT"/>
-              </w:rPr>
-              <w:t>}</w:t>
+              <w:t>GET /ansc/v1/numerazione/serie/{numAnno}/numeri/{numAtto}</w:t>
             </w:r>
           </w:p>
         </w:tc>
@@ -9989,7 +10468,6 @@
                 <w:lang w:val="it-IT"/>
               </w:rPr>
             </w:pPr>
-            <w:proofErr w:type="spellStart"/>
             <w:r>
               <w:rPr>
                 <w:sz w:val="18"/>
@@ -9997,7 +10475,6 @@
               </w:rPr>
               <w:t>aggiornaNumero</w:t>
             </w:r>
-            <w:proofErr w:type="spellEnd"/>
           </w:p>
         </w:tc>
         <w:tc>
@@ -10016,55 +10493,7 @@
                 <w:sz w:val="18"/>
                 <w:lang w:val="it-IT"/>
               </w:rPr>
-              <w:t>PATCH /</w:t>
-            </w:r>
-            <w:proofErr w:type="spellStart"/>
-            <w:r>
-              <w:rPr>
-                <w:sz w:val="18"/>
-                <w:lang w:val="it-IT"/>
-              </w:rPr>
-              <w:t>ansc</w:t>
-            </w:r>
-            <w:proofErr w:type="spellEnd"/>
-            <w:r>
-              <w:rPr>
-                <w:sz w:val="18"/>
-                <w:lang w:val="it-IT"/>
-              </w:rPr>
-              <w:t>/v1/numerazione/serie/{</w:t>
-            </w:r>
-            <w:proofErr w:type="spellStart"/>
-            <w:r>
-              <w:rPr>
-                <w:sz w:val="18"/>
-                <w:lang w:val="it-IT"/>
-              </w:rPr>
-              <w:t>numAnno</w:t>
-            </w:r>
-            <w:proofErr w:type="spellEnd"/>
-            <w:r>
-              <w:rPr>
-                <w:sz w:val="18"/>
-                <w:lang w:val="it-IT"/>
-              </w:rPr>
-              <w:t>}/numeri/{</w:t>
-            </w:r>
-            <w:proofErr w:type="spellStart"/>
-            <w:r>
-              <w:rPr>
-                <w:sz w:val="18"/>
-                <w:lang w:val="it-IT"/>
-              </w:rPr>
-              <w:t>numAtto</w:t>
-            </w:r>
-            <w:proofErr w:type="spellEnd"/>
-            <w:r>
-              <w:rPr>
-                <w:sz w:val="18"/>
-                <w:lang w:val="it-IT"/>
-              </w:rPr>
-              <w:t>}</w:t>
+              <w:t>PATCH /ansc/v1/numerazione/serie/{numAnno}/numeri/{numAtto}</w:t>
             </w:r>
           </w:p>
         </w:tc>
@@ -10120,6 +10549,7 @@
     </w:p>
     <w:p>
       <w:pPr>
+        <w:jc w:val="both"/>
         <w:rPr>
           <w:lang w:val="it-IT"/>
         </w:rPr>
@@ -10139,7 +10569,7 @@
           <w:lang w:val="it-IT"/>
         </w:rPr>
       </w:pPr>
-      <w:bookmarkStart w:id="20" w:name="_Toc243571241"/>
+      <w:bookmarkStart w:id="29" w:name="_Toc243635739"/>
       <w:r>
         <w:rPr>
           <w:lang w:val="it-IT"/>
@@ -10147,7 +10577,7 @@
         <w:lastRenderedPageBreak/>
         <w:t>Che cosa cambia rispetto a Side</w:t>
       </w:r>
-      <w:bookmarkEnd w:id="20"/>
+      <w:bookmarkEnd w:id="29"/>
     </w:p>
     <w:p>
       <w:pPr>
@@ -10529,23 +10959,7 @@
                 <w:sz w:val="18"/>
                 <w:lang w:val="it-IT"/>
               </w:rPr>
-              <w:t>Registro della richiesta (</w:t>
-            </w:r>
-            <w:proofErr w:type="spellStart"/>
-            <w:r>
-              <w:rPr>
-                <w:sz w:val="18"/>
-                <w:lang w:val="it-IT"/>
-              </w:rPr>
-              <w:t>ty_evento</w:t>
-            </w:r>
-            <w:proofErr w:type="spellEnd"/>
-            <w:r>
-              <w:rPr>
-                <w:sz w:val="18"/>
-                <w:lang w:val="it-IT"/>
-              </w:rPr>
-              <w:t>)</w:t>
+              <w:t>Registro della richiesta (ty_evento)</w:t>
             </w:r>
           </w:p>
         </w:tc>
@@ -10806,21 +11220,12 @@
                 <w:lang w:val="it-IT"/>
               </w:rPr>
             </w:pPr>
-            <w:proofErr w:type="spellStart"/>
-            <w:r>
-              <w:rPr>
-                <w:sz w:val="18"/>
-                <w:lang w:val="it-IT"/>
-              </w:rPr>
-              <w:t>id_evento</w:t>
-            </w:r>
-            <w:proofErr w:type="spellEnd"/>
-            <w:r>
-              <w:rPr>
-                <w:sz w:val="18"/>
-                <w:lang w:val="it-IT"/>
-              </w:rPr>
-              <w:t>, verso la tabella degli eventi di Side.</w:t>
+            <w:r>
+              <w:rPr>
+                <w:sz w:val="18"/>
+                <w:lang w:val="it-IT"/>
+              </w:rPr>
+              <w:t>id_evento, verso la tabella degli eventi di Side.</w:t>
             </w:r>
           </w:p>
         </w:tc>
@@ -10835,21 +11240,12 @@
                 <w:lang w:val="it-IT"/>
               </w:rPr>
             </w:pPr>
-            <w:proofErr w:type="spellStart"/>
-            <w:r>
-              <w:rPr>
-                <w:sz w:val="18"/>
-                <w:lang w:val="it-IT"/>
-              </w:rPr>
-              <w:t>id_atto_sipo</w:t>
-            </w:r>
-            <w:proofErr w:type="spellEnd"/>
-            <w:r>
-              <w:rPr>
-                <w:sz w:val="18"/>
-                <w:lang w:val="it-IT"/>
-              </w:rPr>
-              <w:t>.</w:t>
+            <w:r>
+              <w:rPr>
+                <w:sz w:val="18"/>
+                <w:lang w:val="it-IT"/>
+              </w:rPr>
+              <w:t>id_atto_sipo.</w:t>
             </w:r>
           </w:p>
         </w:tc>
@@ -10968,21 +11364,12 @@
                 <w:lang w:val="it-IT"/>
               </w:rPr>
             </w:pPr>
-            <w:proofErr w:type="spellStart"/>
-            <w:r>
-              <w:rPr>
-                <w:sz w:val="18"/>
-                <w:lang w:val="it-IT"/>
-              </w:rPr>
-              <w:t>SIDe</w:t>
-            </w:r>
-            <w:proofErr w:type="spellEnd"/>
-            <w:r>
-              <w:rPr>
-                <w:sz w:val="18"/>
-                <w:lang w:val="it-IT"/>
-              </w:rPr>
-              <w:t xml:space="preserve"> non disponibile (scenari 4 e 5)</w:t>
+            <w:r>
+              <w:rPr>
+                <w:sz w:val="18"/>
+                <w:lang w:val="it-IT"/>
+              </w:rPr>
+              <w:t>SIDe non disponibile (scenari 4 e 5)</w:t>
             </w:r>
           </w:p>
         </w:tc>
@@ -11378,13 +11765,15 @@
     </w:tbl>
     <w:p>
       <w:pPr>
-        <w:rPr>
-          <w:lang w:val="it-IT"/>
-        </w:rPr>
-      </w:pPr>
-    </w:p>
-    <w:p>
-      <w:pPr>
+        <w:jc w:val="both"/>
+        <w:rPr>
+          <w:lang w:val="it-IT"/>
+        </w:rPr>
+      </w:pPr>
+    </w:p>
+    <w:p>
+      <w:pPr>
+        <w:jc w:val="both"/>
         <w:rPr>
           <w:lang w:val="it-IT"/>
         </w:rPr>
@@ -11404,7 +11793,7 @@
           <w:lang w:val="it-IT"/>
         </w:rPr>
       </w:pPr>
-      <w:bookmarkStart w:id="21" w:name="_Toc243571242"/>
+      <w:bookmarkStart w:id="30" w:name="_Toc243635740"/>
       <w:r>
         <w:rPr>
           <w:lang w:val="it-IT"/>
@@ -11412,7 +11801,7 @@
         <w:lastRenderedPageBreak/>
         <w:t>Quesiti e considerazioni</w:t>
       </w:r>
-      <w:bookmarkEnd w:id="21"/>
+      <w:bookmarkEnd w:id="30"/>
     </w:p>
     <w:p>
       <w:pPr>
@@ -11422,14 +11811,14 @@
           <w:lang w:val="it-IT"/>
         </w:rPr>
       </w:pPr>
-      <w:bookmarkStart w:id="22" w:name="_Toc243571243"/>
+      <w:bookmarkStart w:id="31" w:name="_Toc243635741"/>
       <w:r>
         <w:rPr>
           <w:lang w:val="it-IT"/>
         </w:rPr>
         <w:t>L’allineamento con gli atti formati sulla web app</w:t>
       </w:r>
-      <w:bookmarkEnd w:id="22"/>
+      <w:bookmarkEnd w:id="31"/>
     </w:p>
     <w:p>
       <w:pPr>
@@ -11456,23 +11845,7 @@
         <w:rPr>
           <w:lang w:val="it-IT"/>
         </w:rPr>
-        <w:t xml:space="preserve">A Roma i pezzi ci sono già, e cambia il modo. Lo stato Evento acquisito e i legami del numero si scrivono con </w:t>
-      </w:r>
-      <w:proofErr w:type="spellStart"/>
-      <w:proofErr w:type="gramStart"/>
-      <w:r>
-        <w:rPr>
-          <w:lang w:val="it-IT"/>
-        </w:rPr>
-        <w:t>aggiornaNumero</w:t>
-      </w:r>
-      <w:proofErr w:type="spellEnd"/>
-      <w:proofErr w:type="gramEnd"/>
-      <w:r>
-        <w:rPr>
-          <w:lang w:val="it-IT"/>
-        </w:rPr>
-        <w:t xml:space="preserve"> all’aggancio dell’atto; il modello evento intero sta su ANSC_STATO_ATTO.TXT_EVENTO; la lettura dell’atto in ANSC è R005. Il batch non si adotta: la riconciliazione con ANSC si fa su richiesta, non a calendario, come stabilito nell’analisi [R2].</w:t>
+        <w:t>A Roma i pezzi ci sono già, e cambia il modo. Lo stato Evento acquisito e i legami del numero si scrivono con aggiornaNumero all’aggancio dell’atto; il modello evento intero sta su ANSC_STATO_ATTO.TXT_EVENTO; la lettura dell’atto in ANSC è R005. Il batch non si adotta: la riconciliazione con ANSC si fa su richiesta, non a calendario, come stabilito nell’analisi [R2].</w:t>
       </w:r>
     </w:p>
     <w:p>
@@ -11483,14 +11856,14 @@
           <w:lang w:val="it-IT"/>
         </w:rPr>
       </w:pPr>
-      <w:bookmarkStart w:id="23" w:name="_Toc243571244"/>
+      <w:bookmarkStart w:id="32" w:name="_Toc243635742"/>
       <w:r>
         <w:rPr>
           <w:lang w:val="it-IT"/>
         </w:rPr>
         <w:t>Punti aperti</w:t>
       </w:r>
-      <w:bookmarkEnd w:id="23"/>
+      <w:bookmarkEnd w:id="32"/>
     </w:p>
     <w:tbl>
       <w:tblPr>
@@ -12078,8 +12451,8 @@
       </w:pPr>
     </w:p>
     <w:sectPr>
-      <w:headerReference w:type="default" r:id="rId16"/>
-      <w:footerReference w:type="default" r:id="rId17"/>
+      <w:headerReference w:type="default" r:id="rId20"/>
+      <w:footerReference w:type="default" r:id="rId21"/>
       <w:pgSz w:w="12240" w:h="15840"/>
       <w:pgMar w:top="1209" w:right="1440" w:bottom="1440" w:left="1440" w:header="454" w:footer="113" w:gutter="0"/>
       <w:cols w:space="708"/>
@@ -12088,6 +12461,46 @@
     </w:sectPr>
   </w:body>
 </w:document>
+</file>
+
+<file path=word/comments.xml><?xml version="1.0" encoding="utf-8"?>
+<w:comments xmlns:wpc="http://schemas.microsoft.com/office/word/2010/wordprocessingCanvas" xmlns:cx="http://schemas.microsoft.com/office/drawing/2014/chartex" xmlns:cx1="http://schemas.microsoft.com/office/drawing/2015/9/8/chartex" xmlns:cx2="http://schemas.microsoft.com/office/drawing/2015/10/21/chartex" xmlns:cx3="http://schemas.microsoft.com/office/drawing/2016/5/9/chartex" xmlns:cx4="http://schemas.microsoft.com/office/drawing/2016/5/10/chartex" xmlns:cx5="http://schemas.microsoft.com/office/drawing/2016/5/11/chartex" xmlns:cx6="http://schemas.microsoft.com/office/drawing/2016/5/12/chartex" xmlns:cx7="http://schemas.microsoft.com/office/drawing/2016/5/13/chartex" xmlns:cx8="http://schemas.microsoft.com/office/drawing/2016/5/14/chartex" xmlns:mc="http://schemas.openxmlformats.org/markup-compatibility/2006" xmlns:m="http://schemas.openxmlformats.org/officeDocument/2006/math" xmlns:aink="http://schemas.microsoft.com/office/drawing/2016/ink" xmlns:am3d="http://schemas.microsoft.com/office/drawing/2017/model3d" xmlns:oel="http://schemas.microsoft.com/office/2019/extlst" xmlns:r="http://schemas.openxmlformats.org/officeDocument/2006/relationships" xmlns:wp14="http://schemas.microsoft.com/office/word/2010/wordprocessingDrawing" xmlns:wp="http://schemas.openxmlformats.org/drawingml/2006/wordprocessingDrawing" xmlns:wpg="http://schemas.microsoft.com/office/word/2010/wordprocessingGroup" xmlns:wpi="http://schemas.microsoft.com/office/word/2010/wordprocessingInk" xmlns:wps="http://schemas.microsoft.com/office/word/2010/wordprocessingShape" xmlns:o="urn:schemas-microsoft-com:office:office" xmlns:v="urn:schemas-microsoft-com:vml" xmlns:w10="urn:schemas-microsoft-com:office:word" xmlns:w="http://schemas.openxmlformats.org/wordprocessingml/2006/main" xmlns:w14="http://schemas.microsoft.com/office/word/2010/wordml" xmlns:w15="http://schemas.microsoft.com/office/word/2012/wordml" xmlns:w16cex="http://schemas.microsoft.com/office/word/2018/wordml/cex" xmlns:w16cid="http://schemas.microsoft.com/office/word/2016/wordml/cid" xmlns:w16="http://schemas.microsoft.com/office/word/2018/wordml" xmlns:w16sdtdh="http://schemas.microsoft.com/office/word/2020/wordml/sdtdatahash" xmlns:w16sdtfl="http://schemas.microsoft.com/office/word/2024/wordml/sdtformatlock" xmlns:w16se="http://schemas.microsoft.com/office/word/2015/wordml/symex" xmlns:w16du="http://schemas.microsoft.com/office/word/2023/wordml/word16du" xmlns:wne="http://schemas.microsoft.com/office/word/2006/wordml" mc:Ignorable="w14 w15 w16se w16cid w16 w16cex w16sdtdh w16sdtfl w16du wp14">
+  <w:comment w:id="28" w:author="Bernardo Puccetti" w:date="2026-10-23T08:15:00Z" w:initials="BP">
+    <w:p>
+      <w:r>
+        <w:rPr>
+          <w:rStyle w:val="Rimandocommento"/>
+        </w:rPr>
+        <w:annotationRef/>
+      </w:r>
+      <w:r>
+        <w:rPr>
+          <w:sz w:val="20"/>
+          <w:szCs w:val="20"/>
+        </w:rPr>
+        <w:t>Questa parte, per nomenclatura e servizi dovrà essere confermata da Antonino e Giovanni.</w:t>
+      </w:r>
+    </w:p>
+  </w:comment>
+</w:comments>
+</file>
+
+<file path=word/commentsExtended.xml><?xml version="1.0" encoding="utf-8"?>
+<w15:commentsEx xmlns:wpc="http://schemas.microsoft.com/office/word/2010/wordprocessingCanvas" xmlns:cx="http://schemas.microsoft.com/office/drawing/2014/chartex" xmlns:cx1="http://schemas.microsoft.com/office/drawing/2015/9/8/chartex" xmlns:cx2="http://schemas.microsoft.com/office/drawing/2015/10/21/chartex" xmlns:cx3="http://schemas.microsoft.com/office/drawing/2016/5/9/chartex" xmlns:cx4="http://schemas.microsoft.com/office/drawing/2016/5/10/chartex" xmlns:cx5="http://schemas.microsoft.com/office/drawing/2016/5/11/chartex" xmlns:cx6="http://schemas.microsoft.com/office/drawing/2016/5/12/chartex" xmlns:cx7="http://schemas.microsoft.com/office/drawing/2016/5/13/chartex" xmlns:cx8="http://schemas.microsoft.com/office/drawing/2016/5/14/chartex" xmlns:mc="http://schemas.openxmlformats.org/markup-compatibility/2006" xmlns:m="http://schemas.openxmlformats.org/officeDocument/2006/math" xmlns:aink="http://schemas.microsoft.com/office/drawing/2016/ink" xmlns:am3d="http://schemas.microsoft.com/office/drawing/2017/model3d" xmlns:oel="http://schemas.microsoft.com/office/2019/extlst" xmlns:r="http://schemas.openxmlformats.org/officeDocument/2006/relationships" xmlns:wp14="http://schemas.microsoft.com/office/word/2010/wordprocessingDrawing" xmlns:wp="http://schemas.openxmlformats.org/drawingml/2006/wordprocessingDrawing" xmlns:wpg="http://schemas.microsoft.com/office/word/2010/wordprocessingGroup" xmlns:wpi="http://schemas.microsoft.com/office/word/2010/wordprocessingInk" xmlns:wps="http://schemas.microsoft.com/office/word/2010/wordprocessingShape" xmlns:o="urn:schemas-microsoft-com:office:office" xmlns:v="urn:schemas-microsoft-com:vml" xmlns:w10="urn:schemas-microsoft-com:office:word" xmlns:w="http://schemas.openxmlformats.org/wordprocessingml/2006/main" xmlns:w14="http://schemas.microsoft.com/office/word/2010/wordml" xmlns:w15="http://schemas.microsoft.com/office/word/2012/wordml" xmlns:w16cex="http://schemas.microsoft.com/office/word/2018/wordml/cex" xmlns:w16cid="http://schemas.microsoft.com/office/word/2016/wordml/cid" xmlns:w16="http://schemas.microsoft.com/office/word/2018/wordml" xmlns:w16sdtdh="http://schemas.microsoft.com/office/word/2020/wordml/sdtdatahash" xmlns:w16sdtfl="http://schemas.microsoft.com/office/word/2024/wordml/sdtformatlock" xmlns:w16se="http://schemas.microsoft.com/office/word/2015/wordml/symex" xmlns:w16du="http://schemas.microsoft.com/office/word/2023/wordml/word16du" xmlns:wne="http://schemas.microsoft.com/office/word/2006/wordml" mc:Ignorable="w14 w15 w16se w16cid w16 w16cex w16sdtdh w16sdtfl w16du wp14">
+  <w15:commentEx w15:paraId="0D6AA4D0" w15:done="0"/>
+</w15:commentsEx>
+</file>
+
+<file path=word/commentsExtensible.xml><?xml version="1.0" encoding="utf-8"?>
+<w16cex:commentsExtensible xmlns:wpc="http://schemas.microsoft.com/office/word/2010/wordprocessingCanvas" xmlns:cx="http://schemas.microsoft.com/office/drawing/2014/chartex" xmlns:cx1="http://schemas.microsoft.com/office/drawing/2015/9/8/chartex" xmlns:cx2="http://schemas.microsoft.com/office/drawing/2015/10/21/chartex" xmlns:cx3="http://schemas.microsoft.com/office/drawing/2016/5/9/chartex" xmlns:cx4="http://schemas.microsoft.com/office/drawing/2016/5/10/chartex" xmlns:cx5="http://schemas.microsoft.com/office/drawing/2016/5/11/chartex" xmlns:cx6="http://schemas.microsoft.com/office/drawing/2016/5/12/chartex" xmlns:cx7="http://schemas.microsoft.com/office/drawing/2016/5/13/chartex" xmlns:cx8="http://schemas.microsoft.com/office/drawing/2016/5/14/chartex" xmlns:cr="http://schemas.microsoft.com/office/comments/2020/reactions" xmlns:mc="http://schemas.openxmlformats.org/markup-compatibility/2006" xmlns:m="http://schemas.openxmlformats.org/officeDocument/2006/math" xmlns:aink="http://schemas.microsoft.com/office/drawing/2016/ink" xmlns:am3d="http://schemas.microsoft.com/office/drawing/2017/model3d" xmlns:oel="http://schemas.microsoft.com/office/2019/extlst" xmlns:r="http://schemas.openxmlformats.org/officeDocument/2006/relationships" xmlns:wp14="http://schemas.microsoft.com/office/word/2010/wordprocessingDrawing" xmlns:wp="http://schemas.openxmlformats.org/drawingml/2006/wordprocessingDrawing" xmlns:wpg="http://schemas.microsoft.com/office/word/2010/wordprocessingGroup" xmlns:wpi="http://schemas.microsoft.com/office/word/2010/wordprocessingInk" xmlns:wps="http://schemas.microsoft.com/office/word/2010/wordprocessingShape" xmlns:o="urn:schemas-microsoft-com:office:office" xmlns:v="urn:schemas-microsoft-com:vml" xmlns:w10="urn:schemas-microsoft-com:office:word" xmlns:w="http://schemas.openxmlformats.org/wordprocessingml/2006/main" xmlns:w14="http://schemas.microsoft.com/office/word/2010/wordml" xmlns:w15="http://schemas.microsoft.com/office/word/2012/wordml" xmlns:w16cex="http://schemas.microsoft.com/office/word/2018/wordml/cex" xmlns:w16cid="http://schemas.microsoft.com/office/word/2016/wordml/cid" xmlns:w16="http://schemas.microsoft.com/office/word/2018/wordml" xmlns:w16sdtdh="http://schemas.microsoft.com/office/word/2020/wordml/sdtdatahash" xmlns:w16sdtfl="http://schemas.microsoft.com/office/word/2024/wordml/sdtformatlock" xmlns:w16se="http://schemas.microsoft.com/office/word/2015/wordml/symex" xmlns:w16du="http://schemas.microsoft.com/office/word/2023/wordml/word16du" xmlns:wne="http://schemas.microsoft.com/office/word/2006/wordml" mc:Ignorable="w14 w15 w16se w16cid w16 w16cex w16sdtdh w16sdtfl cr w16du wp14">
+  <w16cex:commentExtensible w16cex:durableId="02D21A12" w16cex:dateUtc="2026-10-23T06:15:00Z"/>
+</w16cex:commentsExtensible>
+</file>
+
+<file path=word/commentsIds.xml><?xml version="1.0" encoding="utf-8"?>
+<w16cid:commentsIds xmlns:wpc="http://schemas.microsoft.com/office/word/2010/wordprocessingCanvas" xmlns:cx="http://schemas.microsoft.com/office/drawing/2014/chartex" xmlns:cx1="http://schemas.microsoft.com/office/drawing/2015/9/8/chartex" xmlns:cx2="http://schemas.microsoft.com/office/drawing/2015/10/21/chartex" xmlns:cx3="http://schemas.microsoft.com/office/drawing/2016/5/9/chartex" xmlns:cx4="http://schemas.microsoft.com/office/drawing/2016/5/10/chartex" xmlns:cx5="http://schemas.microsoft.com/office/drawing/2016/5/11/chartex" xmlns:cx6="http://schemas.microsoft.com/office/drawing/2016/5/12/chartex" xmlns:cx7="http://schemas.microsoft.com/office/drawing/2016/5/13/chartex" xmlns:cx8="http://schemas.microsoft.com/office/drawing/2016/5/14/chartex" xmlns:mc="http://schemas.openxmlformats.org/markup-compatibility/2006" xmlns:m="http://schemas.openxmlformats.org/officeDocument/2006/math" xmlns:aink="http://schemas.microsoft.com/office/drawing/2016/ink" xmlns:am3d="http://schemas.microsoft.com/office/drawing/2017/model3d" xmlns:oel="http://schemas.microsoft.com/office/2019/extlst" xmlns:r="http://schemas.openxmlformats.org/officeDocument/2006/relationships" xmlns:wp14="http://schemas.microsoft.com/office/word/2010/wordprocessingDrawing" xmlns:wp="http://schemas.openxmlformats.org/drawingml/2006/wordprocessingDrawing" xmlns:wpg="http://schemas.microsoft.com/office/word/2010/wordprocessingGroup" xmlns:wpi="http://schemas.microsoft.com/office/word/2010/wordprocessingInk" xmlns:wps="http://schemas.microsoft.com/office/word/2010/wordprocessingShape" xmlns:o="urn:schemas-microsoft-com:office:office" xmlns:v="urn:schemas-microsoft-com:vml" xmlns:w10="urn:schemas-microsoft-com:office:word" xmlns:w="http://schemas.openxmlformats.org/wordprocessingml/2006/main" xmlns:w14="http://schemas.microsoft.com/office/word/2010/wordml" xmlns:w15="http://schemas.microsoft.com/office/word/2012/wordml" xmlns:w16cex="http://schemas.microsoft.com/office/word/2018/wordml/cex" xmlns:w16cid="http://schemas.microsoft.com/office/word/2016/wordml/cid" xmlns:w16="http://schemas.microsoft.com/office/word/2018/wordml" xmlns:w16sdtdh="http://schemas.microsoft.com/office/word/2020/wordml/sdtdatahash" xmlns:w16sdtfl="http://schemas.microsoft.com/office/word/2024/wordml/sdtformatlock" xmlns:w16se="http://schemas.microsoft.com/office/word/2015/wordml/symex" xmlns:w16du="http://schemas.microsoft.com/office/word/2023/wordml/word16du" xmlns:wne="http://schemas.microsoft.com/office/word/2006/wordml" mc:Ignorable="w14 w15 w16se w16cid w16 w16cex w16sdtdh w16sdtfl w16du wp14">
+  <w16cid:commentId w16cid:paraId="0D6AA4D0" w16cid:durableId="02D21A12"/>
+</w16cid:commentsIds>
 </file>
 
 <file path=word/endnotes.xml><?xml version="1.0" encoding="utf-8"?>
@@ -13697,7 +14110,45 @@
   <w:num w:numId="9" w16cid:durableId="2068338631">
     <w:abstractNumId w:val="6"/>
   </w:num>
+  <w:num w:numId="10" w16cid:durableId="881359821">
+    <w:abstractNumId w:val="2"/>
+    <w:lvlOverride w:ilvl="0">
+      <w:startOverride w:val="1"/>
+    </w:lvlOverride>
+    <w:lvlOverride w:ilvl="1">
+      <w:startOverride w:val="1"/>
+    </w:lvlOverride>
+    <w:lvlOverride w:ilvl="2">
+      <w:startOverride w:val="1"/>
+    </w:lvlOverride>
+    <w:lvlOverride w:ilvl="3">
+      <w:startOverride w:val="1"/>
+    </w:lvlOverride>
+    <w:lvlOverride w:ilvl="4">
+      <w:startOverride w:val="1"/>
+    </w:lvlOverride>
+    <w:lvlOverride w:ilvl="5">
+      <w:startOverride w:val="1"/>
+    </w:lvlOverride>
+    <w:lvlOverride w:ilvl="6">
+      <w:startOverride w:val="1"/>
+    </w:lvlOverride>
+    <w:lvlOverride w:ilvl="7">
+      <w:startOverride w:val="1"/>
+    </w:lvlOverride>
+    <w:lvlOverride w:ilvl="8">
+      <w:startOverride w:val="1"/>
+    </w:lvlOverride>
+  </w:num>
 </w:numbering>
+</file>
+
+<file path=word/people.xml><?xml version="1.0" encoding="utf-8"?>
+<w15:people xmlns:wpc="http://schemas.microsoft.com/office/word/2010/wordprocessingCanvas" xmlns:cx="http://schemas.microsoft.com/office/drawing/2014/chartex" xmlns:cx1="http://schemas.microsoft.com/office/drawing/2015/9/8/chartex" xmlns:cx2="http://schemas.microsoft.com/office/drawing/2015/10/21/chartex" xmlns:cx3="http://schemas.microsoft.com/office/drawing/2016/5/9/chartex" xmlns:cx4="http://schemas.microsoft.com/office/drawing/2016/5/10/chartex" xmlns:cx5="http://schemas.microsoft.com/office/drawing/2016/5/11/chartex" xmlns:cx6="http://schemas.microsoft.com/office/drawing/2016/5/12/chartex" xmlns:cx7="http://schemas.microsoft.com/office/drawing/2016/5/13/chartex" xmlns:cx8="http://schemas.microsoft.com/office/drawing/2016/5/14/chartex" xmlns:mc="http://schemas.openxmlformats.org/markup-compatibility/2006" xmlns:m="http://schemas.openxmlformats.org/officeDocument/2006/math" xmlns:aink="http://schemas.microsoft.com/office/drawing/2016/ink" xmlns:am3d="http://schemas.microsoft.com/office/drawing/2017/model3d" xmlns:oel="http://schemas.microsoft.com/office/2019/extlst" xmlns:r="http://schemas.openxmlformats.org/officeDocument/2006/relationships" xmlns:wp14="http://schemas.microsoft.com/office/word/2010/wordprocessingDrawing" xmlns:wp="http://schemas.openxmlformats.org/drawingml/2006/wordprocessingDrawing" xmlns:wpg="http://schemas.microsoft.com/office/word/2010/wordprocessingGroup" xmlns:wpi="http://schemas.microsoft.com/office/word/2010/wordprocessingInk" xmlns:wps="http://schemas.microsoft.com/office/word/2010/wordprocessingShape" xmlns:o="urn:schemas-microsoft-com:office:office" xmlns:v="urn:schemas-microsoft-com:vml" xmlns:w10="urn:schemas-microsoft-com:office:word" xmlns:w="http://schemas.openxmlformats.org/wordprocessingml/2006/main" xmlns:w14="http://schemas.microsoft.com/office/word/2010/wordml" xmlns:w15="http://schemas.microsoft.com/office/word/2012/wordml" xmlns:w16cex="http://schemas.microsoft.com/office/word/2018/wordml/cex" xmlns:w16cid="http://schemas.microsoft.com/office/word/2016/wordml/cid" xmlns:w16="http://schemas.microsoft.com/office/word/2018/wordml" xmlns:w16sdtdh="http://schemas.microsoft.com/office/word/2020/wordml/sdtdatahash" xmlns:w16sdtfl="http://schemas.microsoft.com/office/word/2024/wordml/sdtformatlock" xmlns:w16se="http://schemas.microsoft.com/office/word/2015/wordml/symex" xmlns:w16du="http://schemas.microsoft.com/office/word/2023/wordml/word16du" xmlns:wne="http://schemas.microsoft.com/office/word/2006/wordml" mc:Ignorable="w14 w15 w16se w16cid w16 w16cex w16sdtdh w16sdtfl w16du wp14">
+  <w15:person w15:author="Bernardo Puccetti">
+    <w15:presenceInfo w15:providerId="None" w15:userId="Bernardo Puccetti"/>
+  </w15:person>
+</w15:people>
 </file>
 
 <file path=word/styles.xml><?xml version="1.0" encoding="utf-8"?>
@@ -14992,6 +15443,74 @@
       <w:sz w:val="32"/>
     </w:rPr>
   </w:style>
+  <w:style w:type="character" w:styleId="Rimandocommento">
+    <w:name w:val="annotation reference"/>
+    <w:basedOn w:val="Carpredefinitoparagrafo"/>
+    <w:uiPriority w:val="99"/>
+    <w:semiHidden/>
+    <w:unhideWhenUsed/>
+    <w:rsid w:val="004618DA"/>
+    <w:rPr>
+      <w:sz w:val="16"/>
+      <w:szCs w:val="16"/>
+    </w:rPr>
+  </w:style>
+  <w:style w:type="paragraph" w:styleId="Testocommento">
+    <w:name w:val="annotation text"/>
+    <w:basedOn w:val="Normale"/>
+    <w:link w:val="TestocommentoCarattere"/>
+    <w:uiPriority w:val="99"/>
+    <w:semiHidden/>
+    <w:unhideWhenUsed/>
+    <w:rsid w:val="004618DA"/>
+    <w:pPr>
+      <w:spacing w:line="240" w:lineRule="auto"/>
+    </w:pPr>
+    <w:rPr>
+      <w:sz w:val="20"/>
+      <w:szCs w:val="20"/>
+    </w:rPr>
+  </w:style>
+  <w:style w:type="character" w:customStyle="1" w:styleId="TestocommentoCarattere">
+    <w:name w:val="Testo commento Carattere"/>
+    <w:basedOn w:val="Carpredefinitoparagrafo"/>
+    <w:link w:val="Testocommento"/>
+    <w:uiPriority w:val="99"/>
+    <w:semiHidden/>
+    <w:rsid w:val="004618DA"/>
+    <w:rPr>
+      <w:sz w:val="20"/>
+      <w:szCs w:val="20"/>
+    </w:rPr>
+  </w:style>
+  <w:style w:type="paragraph" w:styleId="Soggettocommento">
+    <w:name w:val="annotation subject"/>
+    <w:basedOn w:val="Testocommento"/>
+    <w:next w:val="Testocommento"/>
+    <w:link w:val="SoggettocommentoCarattere"/>
+    <w:uiPriority w:val="99"/>
+    <w:semiHidden/>
+    <w:unhideWhenUsed/>
+    <w:rsid w:val="004618DA"/>
+    <w:rPr>
+      <w:b/>
+      <w:bCs/>
+    </w:rPr>
+  </w:style>
+  <w:style w:type="character" w:customStyle="1" w:styleId="SoggettocommentoCarattere">
+    <w:name w:val="Soggetto commento Carattere"/>
+    <w:basedOn w:val="TestocommentoCarattere"/>
+    <w:link w:val="Soggettocommento"/>
+    <w:uiPriority w:val="99"/>
+    <w:semiHidden/>
+    <w:rsid w:val="004618DA"/>
+    <w:rPr>
+      <w:b/>
+      <w:bCs/>
+      <w:sz w:val="20"/>
+      <w:szCs w:val="20"/>
+    </w:rPr>
+  </w:style>
 </w:styles>
 </file>
 
@@ -15311,6 +15830,10 @@
 </file>
 
 <file path=customXml/item1.xml><?xml version="1.0" encoding="utf-8"?>
+<b:Sources xmlns:b="http://schemas.openxmlformats.org/officeDocument/2006/bibliography" xmlns="http://schemas.openxmlformats.org/officeDocument/2006/bibliography" SelectedStyle="\APASixthEditionOfficeOnline.xsl" StyleName="APA" Version="6"/>
+</file>
+
+<file path=customXml/item2.xml><?xml version="1.0" encoding="utf-8"?>
 <?mso-contentType ?>
 <FormTemplates xmlns="http://schemas.microsoft.com/sharepoint/v3/contenttype/forms">
   <Display>DocumentLibraryForm</Display>
@@ -15319,7 +15842,7 @@
 </FormTemplates>
 </file>
 
-<file path=customXml/item2.xml><?xml version="1.0" encoding="utf-8"?>
+<file path=customXml/item3.xml><?xml version="1.0" encoding="utf-8"?>
 <ct:contentTypeSchema xmlns:ct="http://schemas.microsoft.com/office/2006/metadata/contentType" xmlns:ma="http://schemas.microsoft.com/office/2006/metadata/properties/metaAttributes" ct:_="" ma:_="" ma:contentTypeName="Documento" ma:contentTypeID="0x0101000F70AD27AC816949BF7C819E6DFFF475" ma:contentTypeVersion="7" ma:contentTypeDescription="Creare un nuovo documento." ma:contentTypeScope="" ma:versionID="a3c63e874e08f7b0b0412d3283f410be">
   <xsd:schema xmlns:xsd="http://www.w3.org/2001/XMLSchema" xmlns:xs="http://www.w3.org/2001/XMLSchema" xmlns:p="http://schemas.microsoft.com/office/2006/metadata/properties" xmlns:ns2="320850a0-50f7-4a29-83a2-c11c7ba2e4a4" targetNamespace="http://schemas.microsoft.com/office/2006/metadata/properties" ma:root="true" ma:fieldsID="37eddf013746b268a4a345f63c84cd04" ns2:_="">
     <xsd:import namespace="320850a0-50f7-4a29-83a2-c11c7ba2e4a4"/>
@@ -15481,17 +16004,21 @@
 </ct:contentTypeSchema>
 </file>
 
-<file path=customXml/item3.xml><?xml version="1.0" encoding="utf-8"?>
+<file path=customXml/item4.xml><?xml version="1.0" encoding="utf-8"?>
 <p:properties xmlns:p="http://schemas.microsoft.com/office/2006/metadata/properties" xmlns:xsi="http://www.w3.org/2001/XMLSchema-instance" xmlns:pc="http://schemas.microsoft.com/office/infopath/2007/PartnerControls">
   <documentManagement/>
 </p:properties>
 </file>
 
-<file path=customXml/item4.xml><?xml version="1.0" encoding="utf-8"?>
-<b:Sources xmlns:b="http://schemas.openxmlformats.org/officeDocument/2006/bibliography" xmlns="http://schemas.openxmlformats.org/officeDocument/2006/bibliography" SelectedStyle="\APASixthEditionOfficeOnline.xsl" StyleName="APA" Version="6"/>
+<file path=customXml/itemProps1.xml><?xml version="1.0" encoding="utf-8"?>
+<ds:datastoreItem xmlns:ds="http://schemas.openxmlformats.org/officeDocument/2006/customXml" ds:itemID="{BC6D8BCE-58E4-46C3-BADD-1867298A33AD}">
+  <ds:schemaRefs>
+    <ds:schemaRef ds:uri="http://schemas.openxmlformats.org/officeDocument/2006/bibliography"/>
+  </ds:schemaRefs>
+</ds:datastoreItem>
 </file>
 
-<file path=customXml/itemProps1.xml><?xml version="1.0" encoding="utf-8"?>
+<file path=customXml/itemProps2.xml><?xml version="1.0" encoding="utf-8"?>
 <ds:datastoreItem xmlns:ds="http://schemas.openxmlformats.org/officeDocument/2006/customXml" ds:itemID="{F99C4A69-2199-4F0E-B095-005F11429EED}">
   <ds:schemaRefs>
     <ds:schemaRef ds:uri="http://schemas.microsoft.com/sharepoint/v3/contenttype/forms"/>
@@ -15499,7 +16026,7 @@
 </ds:datastoreItem>
 </file>
 
-<file path=customXml/itemProps2.xml><?xml version="1.0" encoding="utf-8"?>
+<file path=customXml/itemProps3.xml><?xml version="1.0" encoding="utf-8"?>
 <ds:datastoreItem xmlns:ds="http://schemas.openxmlformats.org/officeDocument/2006/customXml" ds:itemID="{B3715E09-15E7-413A-9BF3-994B1F4DCEA0}">
   <ds:schemaRefs>
     <ds:schemaRef ds:uri="http://schemas.microsoft.com/office/2006/metadata/contentType"/>
@@ -15517,19 +16044,11 @@
 </ds:datastoreItem>
 </file>
 
-<file path=customXml/itemProps3.xml><?xml version="1.0" encoding="utf-8"?>
+<file path=customXml/itemProps4.xml><?xml version="1.0" encoding="utf-8"?>
 <ds:datastoreItem xmlns:ds="http://schemas.openxmlformats.org/officeDocument/2006/customXml" ds:itemID="{DE4C094D-D12A-45EF-90D1-D76D17B6E427}">
   <ds:schemaRefs>
     <ds:schemaRef ds:uri="http://schemas.microsoft.com/office/2006/metadata/properties"/>
     <ds:schemaRef ds:uri="http://schemas.microsoft.com/office/infopath/2007/PartnerControls"/>
-  </ds:schemaRefs>
-</ds:datastoreItem>
-</file>
-
-<file path=customXml/itemProps4.xml><?xml version="1.0" encoding="utf-8"?>
-<ds:datastoreItem xmlns:ds="http://schemas.openxmlformats.org/officeDocument/2006/customXml" ds:itemID="{BC6D8BCE-58E4-46C3-BADD-1867298A33AD}">
-  <ds:schemaRefs>
-    <ds:schemaRef ds:uri="http://schemas.openxmlformats.org/officeDocument/2006/bibliography"/>
   </ds:schemaRefs>
 </ds:datastoreItem>
 </file>

</xml_diff>